<commit_message>
Atualização da estrutura do Escopo do Projeto
</commit_message>
<xml_diff>
--- a/escopo.docx
+++ b/escopo.docx
@@ -6,74 +6,122 @@
       <w:pPr>
         <w:rPr>
           <w:rFonts w:ascii="Times New Roman" w:hAnsi="Times New Roman" w:cs="Times New Roman"/>
-          <w:b/>
-          <w:bCs/>
-          <w:sz w:val="20"/>
-          <w:szCs w:val="20"/>
-        </w:rPr>
-      </w:pPr>
-      <w:r>
-        <w:rPr>
-          <w:rFonts w:ascii="Times New Roman" w:hAnsi="Times New Roman" w:cs="Times New Roman"/>
-          <w:b/>
-          <w:bCs/>
-          <w:sz w:val="20"/>
-          <w:szCs w:val="20"/>
-        </w:rPr>
-        <w:t>O melhor começo, sendo iniciante, é focar em um único arquivo (2015), fazer o ETL completo nele e só depois generalizar para os 10 anos.​</w:t>
+          <w:sz w:val="20"/>
+          <w:szCs w:val="20"/>
+        </w:rPr>
+      </w:pPr>
+      <w:r>
+        <w:rPr>
+          <w:rFonts w:ascii="Times New Roman" w:hAnsi="Times New Roman" w:cs="Times New Roman"/>
+          <w:sz w:val="20"/>
+          <w:szCs w:val="20"/>
+        </w:rPr>
+        <w:t>Passo 1 – Preparar o ambiente</w:t>
       </w:r>
     </w:p>
     <w:p>
       <w:pPr>
-        <w:rPr>
-          <w:rFonts w:ascii="Times New Roman" w:hAnsi="Times New Roman" w:cs="Times New Roman"/>
-          <w:b/>
-          <w:bCs/>
-          <w:sz w:val="20"/>
-          <w:szCs w:val="20"/>
-        </w:rPr>
-      </w:pPr>
-      <w:r>
-        <w:rPr>
-          <w:rFonts w:ascii="Times New Roman" w:hAnsi="Times New Roman" w:cs="Times New Roman"/>
-          <w:b/>
-          <w:bCs/>
-          <w:sz w:val="20"/>
-          <w:szCs w:val="20"/>
-        </w:rPr>
-        <w:t>Passo 1 – Preparar o ambiente</w:t>
-      </w:r>
+        <w:pStyle w:val="PargrafodaLista"/>
+        <w:numPr>
+          <w:ilvl w:val="0"/>
+          <w:numId w:val="24"/>
+        </w:numPr>
+        <w:spacing w:after="0"/>
+        <w:rPr>
+          <w:rFonts w:ascii="Times New Roman" w:hAnsi="Times New Roman" w:cs="Times New Roman"/>
+          <w:sz w:val="20"/>
+          <w:szCs w:val="20"/>
+        </w:rPr>
+      </w:pPr>
+      <w:r>
+        <w:rPr>
+          <w:rFonts w:ascii="Times New Roman" w:hAnsi="Times New Roman" w:cs="Times New Roman"/>
+          <w:sz w:val="20"/>
+          <w:szCs w:val="20"/>
+        </w:rPr>
+        <w:t>Garantir as pastas: </w:t>
+      </w:r>
+      <w:proofErr w:type="spellStart"/>
+      <w:r>
+        <w:rPr>
+          <w:rFonts w:ascii="Times New Roman" w:hAnsi="Times New Roman" w:cs="Times New Roman"/>
+          <w:sz w:val="20"/>
+          <w:szCs w:val="20"/>
+        </w:rPr>
+        <w:t>camada_raw</w:t>
+      </w:r>
+      <w:proofErr w:type="spellEnd"/>
+      <w:r>
+        <w:rPr>
+          <w:rFonts w:ascii="Times New Roman" w:hAnsi="Times New Roman" w:cs="Times New Roman"/>
+          <w:sz w:val="20"/>
+          <w:szCs w:val="20"/>
+        </w:rPr>
+        <w:t>, </w:t>
+      </w:r>
+      <w:proofErr w:type="spellStart"/>
+      <w:r>
+        <w:rPr>
+          <w:rFonts w:ascii="Times New Roman" w:hAnsi="Times New Roman" w:cs="Times New Roman"/>
+          <w:sz w:val="20"/>
+          <w:szCs w:val="20"/>
+        </w:rPr>
+        <w:t>camada_stage</w:t>
+      </w:r>
+      <w:proofErr w:type="spellEnd"/>
+      <w:r>
+        <w:rPr>
+          <w:rFonts w:ascii="Times New Roman" w:hAnsi="Times New Roman" w:cs="Times New Roman"/>
+          <w:sz w:val="20"/>
+          <w:szCs w:val="20"/>
+        </w:rPr>
+        <w:t>, </w:t>
+      </w:r>
+      <w:proofErr w:type="spellStart"/>
+      <w:r>
+        <w:rPr>
+          <w:rFonts w:ascii="Times New Roman" w:hAnsi="Times New Roman" w:cs="Times New Roman"/>
+          <w:sz w:val="20"/>
+          <w:szCs w:val="20"/>
+        </w:rPr>
+        <w:t>camada_final</w:t>
+      </w:r>
+      <w:r>
+        <w:rPr>
+          <w:rFonts w:ascii="Times New Roman" w:hAnsi="Times New Roman" w:cs="Times New Roman"/>
+          <w:sz w:val="20"/>
+          <w:szCs w:val="20"/>
+        </w:rPr>
+        <w:t>.</w:t>
+      </w:r>
+      <w:proofErr w:type="spellEnd"/>
     </w:p>
     <w:p>
       <w:pPr>
+        <w:pStyle w:val="PargrafodaLista"/>
         <w:numPr>
           <w:ilvl w:val="0"/>
-          <w:numId w:val="16"/>
+          <w:numId w:val="24"/>
         </w:numPr>
-        <w:rPr>
-          <w:rFonts w:ascii="Times New Roman" w:hAnsi="Times New Roman" w:cs="Times New Roman"/>
-          <w:b/>
-          <w:bCs/>
-          <w:sz w:val="20"/>
-          <w:szCs w:val="20"/>
-        </w:rPr>
-      </w:pPr>
-      <w:r>
-        <w:rPr>
-          <w:rFonts w:ascii="Times New Roman" w:hAnsi="Times New Roman" w:cs="Times New Roman"/>
-          <w:b/>
-          <w:bCs/>
-          <w:sz w:val="20"/>
-          <w:szCs w:val="20"/>
-        </w:rPr>
-        <w:t>Garantir as pastas: </w:t>
+        <w:spacing w:after="0"/>
+        <w:rPr>
+          <w:rFonts w:ascii="Times New Roman" w:hAnsi="Times New Roman" w:cs="Times New Roman"/>
+          <w:sz w:val="20"/>
+          <w:szCs w:val="20"/>
+        </w:rPr>
+      </w:pPr>
+      <w:r>
+        <w:rPr>
+          <w:rFonts w:ascii="Times New Roman" w:hAnsi="Times New Roman" w:cs="Times New Roman"/>
+          <w:sz w:val="20"/>
+          <w:szCs w:val="20"/>
+        </w:rPr>
+        <w:t>Colocar o arquivo chegadas_2015.csv dentro de </w:t>
       </w:r>
       <w:proofErr w:type="spellStart"/>
       <w:r>
         <w:rPr>
           <w:rFonts w:ascii="Times New Roman" w:hAnsi="Times New Roman" w:cs="Times New Roman"/>
-          <w:b/>
-          <w:bCs/>
           <w:sz w:val="20"/>
           <w:szCs w:val="20"/>
         </w:rPr>
@@ -83,214 +131,241 @@
       <w:r>
         <w:rPr>
           <w:rFonts w:ascii="Times New Roman" w:hAnsi="Times New Roman" w:cs="Times New Roman"/>
-          <w:b/>
-          <w:bCs/>
-          <w:sz w:val="20"/>
-          <w:szCs w:val="20"/>
-        </w:rPr>
-        <w:t>, </w:t>
-      </w:r>
-      <w:proofErr w:type="spellStart"/>
-      <w:r>
-        <w:rPr>
-          <w:rFonts w:ascii="Times New Roman" w:hAnsi="Times New Roman" w:cs="Times New Roman"/>
-          <w:b/>
-          <w:bCs/>
-          <w:sz w:val="20"/>
-          <w:szCs w:val="20"/>
-        </w:rPr>
-        <w:t>camada_stage</w:t>
-      </w:r>
-      <w:proofErr w:type="spellEnd"/>
-      <w:r>
-        <w:rPr>
-          <w:rFonts w:ascii="Times New Roman" w:hAnsi="Times New Roman" w:cs="Times New Roman"/>
-          <w:b/>
-          <w:bCs/>
-          <w:sz w:val="20"/>
-          <w:szCs w:val="20"/>
-        </w:rPr>
-        <w:t>, </w:t>
-      </w:r>
-      <w:proofErr w:type="spellStart"/>
-      <w:r>
-        <w:rPr>
-          <w:rFonts w:ascii="Times New Roman" w:hAnsi="Times New Roman" w:cs="Times New Roman"/>
-          <w:b/>
-          <w:bCs/>
-          <w:sz w:val="20"/>
-          <w:szCs w:val="20"/>
-        </w:rPr>
-        <w:t>camada_final</w:t>
-      </w:r>
-      <w:proofErr w:type="spellEnd"/>
-      <w:r>
-        <w:rPr>
-          <w:rFonts w:ascii="Times New Roman" w:hAnsi="Times New Roman" w:cs="Times New Roman"/>
-          <w:b/>
-          <w:bCs/>
-          <w:sz w:val="20"/>
-          <w:szCs w:val="20"/>
-        </w:rPr>
-        <w:t> (que você já criou).​</w:t>
+          <w:sz w:val="20"/>
+          <w:szCs w:val="20"/>
+        </w:rPr>
+        <w:t>.​</w:t>
       </w:r>
     </w:p>
     <w:p>
       <w:pPr>
+        <w:spacing w:after="0"/>
+        <w:rPr>
+          <w:rFonts w:ascii="Times New Roman" w:hAnsi="Times New Roman" w:cs="Times New Roman"/>
+          <w:sz w:val="20"/>
+          <w:szCs w:val="20"/>
+        </w:rPr>
+      </w:pPr>
+    </w:p>
+    <w:p>
+      <w:pPr>
+        <w:rPr>
+          <w:rFonts w:ascii="Times New Roman" w:hAnsi="Times New Roman" w:cs="Times New Roman"/>
+          <w:sz w:val="20"/>
+          <w:szCs w:val="20"/>
+        </w:rPr>
+      </w:pPr>
+      <w:r>
+        <w:rPr>
+          <w:rFonts w:ascii="Times New Roman" w:hAnsi="Times New Roman" w:cs="Times New Roman"/>
+          <w:sz w:val="20"/>
+          <w:szCs w:val="20"/>
+        </w:rPr>
+        <w:t>Passo 2 – Criar o arquivo etl_turismo.py</w:t>
+      </w:r>
+    </w:p>
+    <w:p>
+      <w:pPr>
+        <w:pStyle w:val="PargrafodaLista"/>
         <w:numPr>
           <w:ilvl w:val="0"/>
-          <w:numId w:val="16"/>
+          <w:numId w:val="25"/>
         </w:numPr>
-        <w:rPr>
-          <w:rFonts w:ascii="Times New Roman" w:hAnsi="Times New Roman" w:cs="Times New Roman"/>
-          <w:b/>
-          <w:bCs/>
-          <w:sz w:val="20"/>
-          <w:szCs w:val="20"/>
-        </w:rPr>
-      </w:pPr>
-      <w:r>
-        <w:rPr>
-          <w:rFonts w:ascii="Times New Roman" w:hAnsi="Times New Roman" w:cs="Times New Roman"/>
-          <w:b/>
-          <w:bCs/>
-          <w:sz w:val="20"/>
-          <w:szCs w:val="20"/>
-        </w:rPr>
-        <w:t>Instalar Python 3 e a biblioteca pandas com </w:t>
-      </w:r>
+        <w:spacing w:after="0"/>
+        <w:rPr>
+          <w:rFonts w:ascii="Times New Roman" w:hAnsi="Times New Roman" w:cs="Times New Roman"/>
+          <w:sz w:val="20"/>
+          <w:szCs w:val="20"/>
+        </w:rPr>
+      </w:pPr>
       <w:proofErr w:type="spellStart"/>
       <w:r>
         <w:rPr>
           <w:rFonts w:ascii="Times New Roman" w:hAnsi="Times New Roman" w:cs="Times New Roman"/>
-          <w:b/>
-          <w:bCs/>
-          <w:sz w:val="20"/>
-          <w:szCs w:val="20"/>
-        </w:rPr>
-        <w:t>pip</w:t>
+          <w:sz w:val="20"/>
+          <w:szCs w:val="20"/>
+        </w:rPr>
+        <w:t>extrair_dados</w:t>
       </w:r>
       <w:proofErr w:type="spellEnd"/>
       <w:r>
         <w:rPr>
           <w:rFonts w:ascii="Times New Roman" w:hAnsi="Times New Roman" w:cs="Times New Roman"/>
-          <w:b/>
-          <w:bCs/>
-          <w:sz w:val="20"/>
-          <w:szCs w:val="20"/>
-        </w:rPr>
-        <w:t xml:space="preserve"> </w:t>
+          <w:sz w:val="20"/>
+          <w:szCs w:val="20"/>
+        </w:rPr>
+        <w:t>(</w:t>
       </w:r>
       <w:proofErr w:type="spellStart"/>
       <w:r>
         <w:rPr>
           <w:rFonts w:ascii="Times New Roman" w:hAnsi="Times New Roman" w:cs="Times New Roman"/>
-          <w:b/>
-          <w:bCs/>
-          <w:sz w:val="20"/>
-          <w:szCs w:val="20"/>
-        </w:rPr>
-        <w:t>install</w:t>
+          <w:sz w:val="20"/>
+          <w:szCs w:val="20"/>
+        </w:rPr>
+        <w:t>caminho_arquivo</w:t>
       </w:r>
       <w:proofErr w:type="spellEnd"/>
       <w:r>
         <w:rPr>
           <w:rFonts w:ascii="Times New Roman" w:hAnsi="Times New Roman" w:cs="Times New Roman"/>
-          <w:b/>
-          <w:bCs/>
-          <w:sz w:val="20"/>
-          <w:szCs w:val="20"/>
-        </w:rPr>
-        <w:t xml:space="preserve"> pandas no terminal.</w:t>
+          <w:sz w:val="20"/>
+          <w:szCs w:val="20"/>
+        </w:rPr>
+        <w:t xml:space="preserve">): lê o CSV de 2015 usando pandas e devolve um </w:t>
+      </w:r>
+      <w:proofErr w:type="spellStart"/>
+      <w:r>
+        <w:rPr>
+          <w:rFonts w:ascii="Times New Roman" w:hAnsi="Times New Roman" w:cs="Times New Roman"/>
+          <w:sz w:val="20"/>
+          <w:szCs w:val="20"/>
+        </w:rPr>
+        <w:t>DataFrame</w:t>
+      </w:r>
+      <w:proofErr w:type="spellEnd"/>
+      <w:r>
+        <w:rPr>
+          <w:rFonts w:ascii="Times New Roman" w:hAnsi="Times New Roman" w:cs="Times New Roman"/>
+          <w:sz w:val="20"/>
+          <w:szCs w:val="20"/>
+        </w:rPr>
+        <w:t>.​</w:t>
+      </w:r>
+      <w:proofErr w:type="spellStart"/>
+      <w:r>
+        <w:rPr>
+          <w:rFonts w:ascii="Times New Roman" w:hAnsi="Times New Roman" w:cs="Times New Roman"/>
+          <w:sz w:val="20"/>
+          <w:szCs w:val="20"/>
+        </w:rPr>
+        <w:t>transformar_dados</w:t>
+      </w:r>
+      <w:proofErr w:type="spellEnd"/>
+      <w:r>
+        <w:rPr>
+          <w:rFonts w:ascii="Times New Roman" w:hAnsi="Times New Roman" w:cs="Times New Roman"/>
+          <w:sz w:val="20"/>
+          <w:szCs w:val="20"/>
+        </w:rPr>
+        <w:t>(</w:t>
+      </w:r>
+      <w:proofErr w:type="spellStart"/>
+      <w:r>
+        <w:rPr>
+          <w:rFonts w:ascii="Times New Roman" w:hAnsi="Times New Roman" w:cs="Times New Roman"/>
+          <w:sz w:val="20"/>
+          <w:szCs w:val="20"/>
+        </w:rPr>
+        <w:t>df</w:t>
+      </w:r>
+      <w:proofErr w:type="spellEnd"/>
+      <w:r>
+        <w:rPr>
+          <w:rFonts w:ascii="Times New Roman" w:hAnsi="Times New Roman" w:cs="Times New Roman"/>
+          <w:sz w:val="20"/>
+          <w:szCs w:val="20"/>
+        </w:rPr>
+        <w:t>):</w:t>
       </w:r>
     </w:p>
     <w:p>
       <w:pPr>
+        <w:pStyle w:val="PargrafodaLista"/>
         <w:numPr>
           <w:ilvl w:val="0"/>
-          <w:numId w:val="16"/>
+          <w:numId w:val="25"/>
         </w:numPr>
-        <w:rPr>
-          <w:rFonts w:ascii="Times New Roman" w:hAnsi="Times New Roman" w:cs="Times New Roman"/>
-          <w:b/>
-          <w:bCs/>
-          <w:sz w:val="20"/>
-          <w:szCs w:val="20"/>
-        </w:rPr>
-      </w:pPr>
-      <w:r>
-        <w:rPr>
-          <w:rFonts w:ascii="Times New Roman" w:hAnsi="Times New Roman" w:cs="Times New Roman"/>
-          <w:b/>
-          <w:bCs/>
-          <w:sz w:val="20"/>
-          <w:szCs w:val="20"/>
-        </w:rPr>
-        <w:t>Colocar o arquivo chegadas_2015.csv dentro de </w:t>
-      </w:r>
-      <w:proofErr w:type="spellStart"/>
-      <w:r>
-        <w:rPr>
-          <w:rFonts w:ascii="Times New Roman" w:hAnsi="Times New Roman" w:cs="Times New Roman"/>
-          <w:b/>
-          <w:bCs/>
-          <w:sz w:val="20"/>
-          <w:szCs w:val="20"/>
-        </w:rPr>
-        <w:t>camada_raw</w:t>
-      </w:r>
-      <w:proofErr w:type="spellEnd"/>
-      <w:r>
-        <w:rPr>
-          <w:rFonts w:ascii="Times New Roman" w:hAnsi="Times New Roman" w:cs="Times New Roman"/>
-          <w:b/>
-          <w:bCs/>
-          <w:sz w:val="20"/>
-          <w:szCs w:val="20"/>
-        </w:rPr>
-        <w:t>.​</w:t>
+        <w:spacing w:after="0"/>
+        <w:rPr>
+          <w:rFonts w:ascii="Times New Roman" w:hAnsi="Times New Roman" w:cs="Times New Roman"/>
+          <w:sz w:val="20"/>
+          <w:szCs w:val="20"/>
+        </w:rPr>
+      </w:pPr>
+      <w:r>
+        <w:rPr>
+          <w:rFonts w:ascii="Times New Roman" w:hAnsi="Times New Roman" w:cs="Times New Roman"/>
+          <w:sz w:val="20"/>
+          <w:szCs w:val="20"/>
+        </w:rPr>
+        <w:t>renomeia as colunas para nomes simples (ex.: Continente → continente, Chegadas → chegadas),</w:t>
       </w:r>
     </w:p>
     <w:p>
       <w:pPr>
-        <w:rPr>
-          <w:rFonts w:ascii="Times New Roman" w:hAnsi="Times New Roman" w:cs="Times New Roman"/>
-          <w:b/>
-          <w:bCs/>
-          <w:sz w:val="20"/>
-          <w:szCs w:val="20"/>
-        </w:rPr>
-      </w:pPr>
-      <w:r>
-        <w:rPr>
-          <w:rFonts w:ascii="Times New Roman" w:hAnsi="Times New Roman" w:cs="Times New Roman"/>
-          <w:b/>
-          <w:bCs/>
-          <w:sz w:val="20"/>
-          <w:szCs w:val="20"/>
-        </w:rPr>
-        <w:t>Passo 2 – Criar o arquivo etl_turismo.py</w:t>
+        <w:spacing w:after="0"/>
+        <w:rPr>
+          <w:rFonts w:ascii="Times New Roman" w:hAnsi="Times New Roman" w:cs="Times New Roman"/>
+          <w:sz w:val="20"/>
+          <w:szCs w:val="20"/>
+        </w:rPr>
+      </w:pPr>
+      <w:r>
+        <w:rPr>
+          <w:rFonts w:ascii="Times New Roman" w:hAnsi="Times New Roman" w:cs="Times New Roman"/>
+          <w:sz w:val="20"/>
+          <w:szCs w:val="20"/>
+        </w:rPr>
+        <w:t xml:space="preserve">garante tipos corretos (ano inteiro, </w:t>
+      </w:r>
+      <w:proofErr w:type="gramStart"/>
+      <w:r>
+        <w:rPr>
+          <w:rFonts w:ascii="Times New Roman" w:hAnsi="Times New Roman" w:cs="Times New Roman"/>
+          <w:sz w:val="20"/>
+          <w:szCs w:val="20"/>
+        </w:rPr>
+        <w:t>chegadas inteiro</w:t>
+      </w:r>
+      <w:proofErr w:type="gramEnd"/>
+      <w:r>
+        <w:rPr>
+          <w:rFonts w:ascii="Times New Roman" w:hAnsi="Times New Roman" w:cs="Times New Roman"/>
+          <w:sz w:val="20"/>
+          <w:szCs w:val="20"/>
+        </w:rPr>
+        <w:t>),</w:t>
       </w:r>
     </w:p>
     <w:p>
       <w:pPr>
-        <w:rPr>
-          <w:rFonts w:ascii="Times New Roman" w:hAnsi="Times New Roman" w:cs="Times New Roman"/>
-          <w:b/>
-          <w:bCs/>
-          <w:sz w:val="20"/>
-          <w:szCs w:val="20"/>
-        </w:rPr>
-      </w:pPr>
-      <w:r>
-        <w:rPr>
-          <w:rFonts w:ascii="Times New Roman" w:hAnsi="Times New Roman" w:cs="Times New Roman"/>
-          <w:b/>
-          <w:bCs/>
-          <w:sz w:val="20"/>
-          <w:szCs w:val="20"/>
-        </w:rPr>
-        <w:t>Dentro da pasta do projeto, criar um arquivo etl_turismo.py com esta ideia de funções (por enquanto só o “esqueleto”, sem se preocupar em fazer tudo perfeito):</w:t>
+        <w:pStyle w:val="PargrafodaLista"/>
+        <w:numPr>
+          <w:ilvl w:val="0"/>
+          <w:numId w:val="26"/>
+        </w:numPr>
+        <w:rPr>
+          <w:rFonts w:ascii="Times New Roman" w:hAnsi="Times New Roman" w:cs="Times New Roman"/>
+          <w:sz w:val="20"/>
+          <w:szCs w:val="20"/>
+        </w:rPr>
+      </w:pPr>
+      <w:r>
+        <w:rPr>
+          <w:rFonts w:ascii="Times New Roman" w:hAnsi="Times New Roman" w:cs="Times New Roman"/>
+          <w:sz w:val="20"/>
+          <w:szCs w:val="20"/>
+        </w:rPr>
+        <w:t>trata caracteres estranhos como </w:t>
+      </w:r>
+      <w:proofErr w:type="spellStart"/>
+      <w:r>
+        <w:rPr>
+          <w:rFonts w:ascii="Times New Roman" w:hAnsi="Times New Roman" w:cs="Times New Roman"/>
+          <w:sz w:val="20"/>
+          <w:szCs w:val="20"/>
+        </w:rPr>
+        <w:t>Męs</w:t>
+      </w:r>
+      <w:proofErr w:type="spellEnd"/>
+      <w:r>
+        <w:rPr>
+          <w:rFonts w:ascii="Times New Roman" w:hAnsi="Times New Roman" w:cs="Times New Roman"/>
+          <w:sz w:val="20"/>
+          <w:szCs w:val="20"/>
+        </w:rPr>
+        <w:t> para Mês.​</w:t>
       </w:r>
     </w:p>
     <w:p>
@@ -301,8 +376,6 @@
         </w:numPr>
         <w:rPr>
           <w:rFonts w:ascii="Times New Roman" w:hAnsi="Times New Roman" w:cs="Times New Roman"/>
-          <w:b/>
-          <w:bCs/>
           <w:sz w:val="20"/>
           <w:szCs w:val="20"/>
         </w:rPr>
@@ -311,19 +384,15 @@
       <w:r>
         <w:rPr>
           <w:rFonts w:ascii="Times New Roman" w:hAnsi="Times New Roman" w:cs="Times New Roman"/>
-          <w:b/>
-          <w:bCs/>
-          <w:sz w:val="20"/>
-          <w:szCs w:val="20"/>
-        </w:rPr>
-        <w:t>extrair_dados</w:t>
+          <w:sz w:val="20"/>
+          <w:szCs w:val="20"/>
+        </w:rPr>
+        <w:t>carregar_dados</w:t>
       </w:r>
       <w:proofErr w:type="spellEnd"/>
       <w:r>
         <w:rPr>
           <w:rFonts w:ascii="Times New Roman" w:hAnsi="Times New Roman" w:cs="Times New Roman"/>
-          <w:b/>
-          <w:bCs/>
           <w:sz w:val="20"/>
           <w:szCs w:val="20"/>
         </w:rPr>
@@ -333,30 +402,24 @@
       <w:r>
         <w:rPr>
           <w:rFonts w:ascii="Times New Roman" w:hAnsi="Times New Roman" w:cs="Times New Roman"/>
-          <w:b/>
-          <w:bCs/>
-          <w:sz w:val="20"/>
-          <w:szCs w:val="20"/>
-        </w:rPr>
-        <w:t>caminho_arquivo</w:t>
+          <w:sz w:val="20"/>
+          <w:szCs w:val="20"/>
+        </w:rPr>
+        <w:t>df</w:t>
       </w:r>
       <w:proofErr w:type="spellEnd"/>
       <w:r>
         <w:rPr>
           <w:rFonts w:ascii="Times New Roman" w:hAnsi="Times New Roman" w:cs="Times New Roman"/>
-          <w:b/>
-          <w:bCs/>
-          <w:sz w:val="20"/>
-          <w:szCs w:val="20"/>
-        </w:rPr>
-        <w:t xml:space="preserve">): lê o CSV de 2015 usando pandas e devolve um </w:t>
+          <w:sz w:val="20"/>
+          <w:szCs w:val="20"/>
+        </w:rPr>
+        <w:t xml:space="preserve">): salva o </w:t>
       </w:r>
       <w:proofErr w:type="spellStart"/>
       <w:r>
         <w:rPr>
           <w:rFonts w:ascii="Times New Roman" w:hAnsi="Times New Roman" w:cs="Times New Roman"/>
-          <w:b/>
-          <w:bCs/>
           <w:sz w:val="20"/>
           <w:szCs w:val="20"/>
         </w:rPr>
@@ -366,564 +429,543 @@
       <w:r>
         <w:rPr>
           <w:rFonts w:ascii="Times New Roman" w:hAnsi="Times New Roman" w:cs="Times New Roman"/>
-          <w:b/>
-          <w:bCs/>
-          <w:sz w:val="20"/>
-          <w:szCs w:val="20"/>
-        </w:rPr>
-        <w:t>.​</w:t>
+          <w:sz w:val="20"/>
+          <w:szCs w:val="20"/>
+        </w:rPr>
+        <w:t xml:space="preserve"> transformado como um novo CSV em </w:t>
+      </w:r>
+      <w:proofErr w:type="spellStart"/>
+      <w:r>
+        <w:rPr>
+          <w:rFonts w:ascii="Times New Roman" w:hAnsi="Times New Roman" w:cs="Times New Roman"/>
+          <w:sz w:val="20"/>
+          <w:szCs w:val="20"/>
+        </w:rPr>
+        <w:t>camada_stage</w:t>
+      </w:r>
+      <w:proofErr w:type="spellEnd"/>
+      <w:r>
+        <w:rPr>
+          <w:rFonts w:ascii="Times New Roman" w:hAnsi="Times New Roman" w:cs="Times New Roman"/>
+          <w:sz w:val="20"/>
+          <w:szCs w:val="20"/>
+        </w:rPr>
+        <w:t>/chegadas_2015_tratado.csv.​</w:t>
       </w:r>
     </w:p>
     <w:p>
       <w:pPr>
+        <w:rPr>
+          <w:rFonts w:ascii="Times New Roman" w:hAnsi="Times New Roman" w:cs="Times New Roman"/>
+          <w:sz w:val="20"/>
+          <w:szCs w:val="20"/>
+        </w:rPr>
+      </w:pPr>
+      <w:r>
+        <w:rPr>
+          <w:rFonts w:ascii="Times New Roman" w:hAnsi="Times New Roman" w:cs="Times New Roman"/>
+          <w:sz w:val="20"/>
+          <w:szCs w:val="20"/>
+        </w:rPr>
+        <w:t>No final do arquivo, criar um bloco “principal” que chama as três funções nessa ordem, tudo só para o ano de 2015.</w:t>
+      </w:r>
+    </w:p>
+    <w:p>
+      <w:pPr>
+        <w:rPr>
+          <w:rFonts w:ascii="Times New Roman" w:hAnsi="Times New Roman" w:cs="Times New Roman"/>
+          <w:sz w:val="20"/>
+          <w:szCs w:val="20"/>
+        </w:rPr>
+      </w:pPr>
+      <w:r>
+        <w:rPr>
+          <w:rFonts w:ascii="Times New Roman" w:hAnsi="Times New Roman" w:cs="Times New Roman"/>
+          <w:sz w:val="20"/>
+          <w:szCs w:val="20"/>
+        </w:rPr>
+        <w:t>Passo 3 – Validar o resultado</w:t>
+      </w:r>
+    </w:p>
+    <w:p>
+      <w:pPr>
+        <w:pStyle w:val="PargrafodaLista"/>
         <w:numPr>
           <w:ilvl w:val="0"/>
           <w:numId w:val="17"/>
         </w:numPr>
-        <w:rPr>
-          <w:rFonts w:ascii="Times New Roman" w:hAnsi="Times New Roman" w:cs="Times New Roman"/>
-          <w:b/>
-          <w:bCs/>
-          <w:sz w:val="20"/>
-          <w:szCs w:val="20"/>
-        </w:rPr>
-      </w:pPr>
+        <w:spacing w:after="0"/>
+        <w:rPr>
+          <w:rFonts w:ascii="Times New Roman" w:hAnsi="Times New Roman" w:cs="Times New Roman"/>
+          <w:sz w:val="20"/>
+          <w:szCs w:val="20"/>
+        </w:rPr>
+      </w:pPr>
+      <w:r>
+        <w:rPr>
+          <w:rFonts w:ascii="Times New Roman" w:hAnsi="Times New Roman" w:cs="Times New Roman"/>
+          <w:sz w:val="20"/>
+          <w:szCs w:val="20"/>
+        </w:rPr>
+        <w:t>Abrir o CSV de saída na </w:t>
+      </w:r>
       <w:proofErr w:type="spellStart"/>
       <w:r>
         <w:rPr>
           <w:rFonts w:ascii="Times New Roman" w:hAnsi="Times New Roman" w:cs="Times New Roman"/>
-          <w:b/>
-          <w:bCs/>
-          <w:sz w:val="20"/>
-          <w:szCs w:val="20"/>
-        </w:rPr>
-        <w:t>transformar_dados</w:t>
+          <w:sz w:val="20"/>
+          <w:szCs w:val="20"/>
+        </w:rPr>
+        <w:t>camada_stage</w:t>
       </w:r>
       <w:proofErr w:type="spellEnd"/>
       <w:r>
         <w:rPr>
           <w:rFonts w:ascii="Times New Roman" w:hAnsi="Times New Roman" w:cs="Times New Roman"/>
-          <w:b/>
-          <w:bCs/>
-          <w:sz w:val="20"/>
-          <w:szCs w:val="20"/>
-        </w:rPr>
-        <w:t>(</w:t>
-      </w:r>
-      <w:proofErr w:type="spellStart"/>
-      <w:r>
-        <w:rPr>
-          <w:rFonts w:ascii="Times New Roman" w:hAnsi="Times New Roman" w:cs="Times New Roman"/>
-          <w:b/>
-          <w:bCs/>
-          <w:sz w:val="20"/>
-          <w:szCs w:val="20"/>
-        </w:rPr>
-        <w:t>df</w:t>
-      </w:r>
-      <w:proofErr w:type="spellEnd"/>
-      <w:r>
-        <w:rPr>
-          <w:rFonts w:ascii="Times New Roman" w:hAnsi="Times New Roman" w:cs="Times New Roman"/>
-          <w:b/>
-          <w:bCs/>
-          <w:sz w:val="20"/>
-          <w:szCs w:val="20"/>
-        </w:rPr>
-        <w:t>):</w:t>
+          <w:sz w:val="20"/>
+          <w:szCs w:val="20"/>
+        </w:rPr>
+        <w:t> e conferir se as colunas estão com nomes certinhos e se a contagem de linhas faz sentido.​</w:t>
       </w:r>
     </w:p>
     <w:p>
       <w:pPr>
-        <w:numPr>
-          <w:ilvl w:val="1"/>
-          <w:numId w:val="17"/>
-        </w:numPr>
-        <w:rPr>
-          <w:rFonts w:ascii="Times New Roman" w:hAnsi="Times New Roman" w:cs="Times New Roman"/>
-          <w:b/>
-          <w:bCs/>
-          <w:sz w:val="20"/>
-          <w:szCs w:val="20"/>
-        </w:rPr>
-      </w:pPr>
-      <w:r>
-        <w:rPr>
-          <w:rFonts w:ascii="Times New Roman" w:hAnsi="Times New Roman" w:cs="Times New Roman"/>
-          <w:b/>
-          <w:bCs/>
-          <w:sz w:val="20"/>
-          <w:szCs w:val="20"/>
-        </w:rPr>
-        <w:t>renomeia as colunas para nomes simples (ex.: Continente → continente, Chegadas → chegadas),</w:t>
-      </w:r>
-    </w:p>
-    <w:p>
-      <w:pPr>
-        <w:numPr>
-          <w:ilvl w:val="1"/>
-          <w:numId w:val="17"/>
-        </w:numPr>
-        <w:rPr>
-          <w:rFonts w:ascii="Times New Roman" w:hAnsi="Times New Roman" w:cs="Times New Roman"/>
-          <w:b/>
-          <w:bCs/>
-          <w:sz w:val="20"/>
-          <w:szCs w:val="20"/>
-        </w:rPr>
-      </w:pPr>
-      <w:r>
-        <w:rPr>
-          <w:rFonts w:ascii="Times New Roman" w:hAnsi="Times New Roman" w:cs="Times New Roman"/>
-          <w:b/>
-          <w:bCs/>
-          <w:sz w:val="20"/>
-          <w:szCs w:val="20"/>
-        </w:rPr>
-        <w:t xml:space="preserve">garante tipos corretos (ano inteiro, </w:t>
-      </w:r>
-      <w:proofErr w:type="gramStart"/>
-      <w:r>
-        <w:rPr>
-          <w:rFonts w:ascii="Times New Roman" w:hAnsi="Times New Roman" w:cs="Times New Roman"/>
-          <w:b/>
-          <w:bCs/>
-          <w:sz w:val="20"/>
-          <w:szCs w:val="20"/>
-        </w:rPr>
-        <w:t>chegadas inteiro</w:t>
-      </w:r>
-      <w:proofErr w:type="gramEnd"/>
-      <w:r>
-        <w:rPr>
-          <w:rFonts w:ascii="Times New Roman" w:hAnsi="Times New Roman" w:cs="Times New Roman"/>
-          <w:b/>
-          <w:bCs/>
-          <w:sz w:val="20"/>
-          <w:szCs w:val="20"/>
-        </w:rPr>
-        <w:t>),</w:t>
-      </w:r>
-    </w:p>
-    <w:p>
-      <w:pPr>
-        <w:numPr>
-          <w:ilvl w:val="1"/>
-          <w:numId w:val="17"/>
-        </w:numPr>
-        <w:rPr>
-          <w:rFonts w:ascii="Times New Roman" w:hAnsi="Times New Roman" w:cs="Times New Roman"/>
-          <w:b/>
-          <w:bCs/>
-          <w:sz w:val="20"/>
-          <w:szCs w:val="20"/>
-        </w:rPr>
-      </w:pPr>
-      <w:r>
-        <w:rPr>
-          <w:rFonts w:ascii="Times New Roman" w:hAnsi="Times New Roman" w:cs="Times New Roman"/>
-          <w:b/>
-          <w:bCs/>
-          <w:sz w:val="20"/>
-          <w:szCs w:val="20"/>
-        </w:rPr>
-        <w:t>trata caracteres estranhos como </w:t>
-      </w:r>
-      <w:proofErr w:type="spellStart"/>
-      <w:r>
-        <w:rPr>
-          <w:rFonts w:ascii="Times New Roman" w:hAnsi="Times New Roman" w:cs="Times New Roman"/>
-          <w:b/>
-          <w:bCs/>
-          <w:sz w:val="20"/>
-          <w:szCs w:val="20"/>
-        </w:rPr>
-        <w:t>Męs</w:t>
-      </w:r>
-      <w:proofErr w:type="spellEnd"/>
-      <w:r>
-        <w:rPr>
-          <w:rFonts w:ascii="Times New Roman" w:hAnsi="Times New Roman" w:cs="Times New Roman"/>
-          <w:b/>
-          <w:bCs/>
-          <w:sz w:val="20"/>
-          <w:szCs w:val="20"/>
-        </w:rPr>
-        <w:t> para Mês.​</w:t>
-      </w:r>
-    </w:p>
-    <w:p>
-      <w:pPr>
+        <w:pStyle w:val="PargrafodaLista"/>
         <w:numPr>
           <w:ilvl w:val="0"/>
           <w:numId w:val="17"/>
         </w:numPr>
-        <w:rPr>
-          <w:rFonts w:ascii="Times New Roman" w:hAnsi="Times New Roman" w:cs="Times New Roman"/>
-          <w:b/>
-          <w:bCs/>
-          <w:sz w:val="20"/>
-          <w:szCs w:val="20"/>
-        </w:rPr>
-      </w:pPr>
+        <w:spacing w:after="0"/>
+        <w:rPr>
+          <w:rFonts w:ascii="Times New Roman" w:hAnsi="Times New Roman" w:cs="Times New Roman"/>
+          <w:sz w:val="20"/>
+          <w:szCs w:val="20"/>
+        </w:rPr>
+      </w:pPr>
+      <w:r>
+        <w:rPr>
+          <w:rFonts w:ascii="Times New Roman" w:hAnsi="Times New Roman" w:cs="Times New Roman"/>
+          <w:sz w:val="20"/>
+          <w:szCs w:val="20"/>
+        </w:rPr>
+        <w:t>Fazer testes simples em Python, como somar todas as chegadas de 2015 (</w:t>
+      </w:r>
       <w:proofErr w:type="spellStart"/>
       <w:r>
         <w:rPr>
           <w:rFonts w:ascii="Times New Roman" w:hAnsi="Times New Roman" w:cs="Times New Roman"/>
-          <w:b/>
-          <w:bCs/>
-          <w:sz w:val="20"/>
-          <w:szCs w:val="20"/>
-        </w:rPr>
-        <w:t>carregar_dados</w:t>
+          <w:sz w:val="20"/>
+          <w:szCs w:val="20"/>
+        </w:rPr>
+        <w:t>df</w:t>
       </w:r>
       <w:proofErr w:type="spellEnd"/>
       <w:r>
         <w:rPr>
           <w:rFonts w:ascii="Times New Roman" w:hAnsi="Times New Roman" w:cs="Times New Roman"/>
-          <w:b/>
-          <w:bCs/>
-          <w:sz w:val="20"/>
-          <w:szCs w:val="20"/>
-        </w:rPr>
-        <w:t>(</w:t>
-      </w:r>
-      <w:proofErr w:type="spellStart"/>
-      <w:r>
-        <w:rPr>
-          <w:rFonts w:ascii="Times New Roman" w:hAnsi="Times New Roman" w:cs="Times New Roman"/>
-          <w:b/>
-          <w:bCs/>
-          <w:sz w:val="20"/>
-          <w:szCs w:val="20"/>
-        </w:rPr>
-        <w:t>df</w:t>
-      </w:r>
-      <w:proofErr w:type="spellEnd"/>
-      <w:r>
-        <w:rPr>
-          <w:rFonts w:ascii="Times New Roman" w:hAnsi="Times New Roman" w:cs="Times New Roman"/>
-          <w:b/>
-          <w:bCs/>
-          <w:sz w:val="20"/>
-          <w:szCs w:val="20"/>
-        </w:rPr>
-        <w:t xml:space="preserve">): salva o </w:t>
-      </w:r>
-      <w:proofErr w:type="spellStart"/>
-      <w:r>
-        <w:rPr>
-          <w:rFonts w:ascii="Times New Roman" w:hAnsi="Times New Roman" w:cs="Times New Roman"/>
-          <w:b/>
-          <w:bCs/>
-          <w:sz w:val="20"/>
-          <w:szCs w:val="20"/>
-        </w:rPr>
-        <w:t>DataFrame</w:t>
-      </w:r>
-      <w:proofErr w:type="spellEnd"/>
-      <w:r>
-        <w:rPr>
-          <w:rFonts w:ascii="Times New Roman" w:hAnsi="Times New Roman" w:cs="Times New Roman"/>
-          <w:b/>
-          <w:bCs/>
-          <w:sz w:val="20"/>
-          <w:szCs w:val="20"/>
-        </w:rPr>
-        <w:t xml:space="preserve"> transformado como um novo CSV em </w:t>
-      </w:r>
-      <w:proofErr w:type="spellStart"/>
-      <w:r>
-        <w:rPr>
-          <w:rFonts w:ascii="Times New Roman" w:hAnsi="Times New Roman" w:cs="Times New Roman"/>
-          <w:b/>
-          <w:bCs/>
-          <w:sz w:val="20"/>
-          <w:szCs w:val="20"/>
-        </w:rPr>
-        <w:t>camada_stage</w:t>
-      </w:r>
-      <w:proofErr w:type="spellEnd"/>
-      <w:r>
-        <w:rPr>
-          <w:rFonts w:ascii="Times New Roman" w:hAnsi="Times New Roman" w:cs="Times New Roman"/>
-          <w:b/>
-          <w:bCs/>
-          <w:sz w:val="20"/>
-          <w:szCs w:val="20"/>
-        </w:rPr>
-        <w:t>/chegadas_2015_tratado.csv.​</w:t>
+          <w:sz w:val="20"/>
+          <w:szCs w:val="20"/>
+        </w:rPr>
+        <w:t>['chegadas'</w:t>
+      </w:r>
+      <w:proofErr w:type="gramStart"/>
+      <w:r>
+        <w:rPr>
+          <w:rFonts w:ascii="Times New Roman" w:hAnsi="Times New Roman" w:cs="Times New Roman"/>
+          <w:sz w:val="20"/>
+          <w:szCs w:val="20"/>
+        </w:rPr>
+        <w:t>].sum</w:t>
+      </w:r>
+      <w:proofErr w:type="gramEnd"/>
+      <w:r>
+        <w:rPr>
+          <w:rFonts w:ascii="Times New Roman" w:hAnsi="Times New Roman" w:cs="Times New Roman"/>
+          <w:sz w:val="20"/>
+          <w:szCs w:val="20"/>
+        </w:rPr>
+        <w:t>()) para ver se o dado parece razoável.​</w:t>
       </w:r>
     </w:p>
     <w:p>
       <w:pPr>
-        <w:rPr>
-          <w:rFonts w:ascii="Times New Roman" w:hAnsi="Times New Roman" w:cs="Times New Roman"/>
-          <w:b/>
-          <w:bCs/>
-          <w:sz w:val="20"/>
-          <w:szCs w:val="20"/>
-        </w:rPr>
-      </w:pPr>
-      <w:r>
-        <w:rPr>
-          <w:rFonts w:ascii="Times New Roman" w:hAnsi="Times New Roman" w:cs="Times New Roman"/>
-          <w:b/>
-          <w:bCs/>
-          <w:sz w:val="20"/>
-          <w:szCs w:val="20"/>
-        </w:rPr>
-        <w:t>No final do arquivo, criar um bloco “principal” que chama as três funções nessa ordem, tudo só para o ano de 2015.</w:t>
-      </w:r>
+        <w:spacing w:after="0"/>
+        <w:rPr>
+          <w:rFonts w:ascii="Times New Roman" w:hAnsi="Times New Roman" w:cs="Times New Roman"/>
+          <w:sz w:val="20"/>
+          <w:szCs w:val="20"/>
+        </w:rPr>
+      </w:pPr>
     </w:p>
     <w:p>
       <w:pPr>
         <w:rPr>
           <w:rFonts w:ascii="Times New Roman" w:hAnsi="Times New Roman" w:cs="Times New Roman"/>
-          <w:b/>
-          <w:bCs/>
-          <w:sz w:val="20"/>
-          <w:szCs w:val="20"/>
-        </w:rPr>
-      </w:pPr>
-      <w:r>
-        <w:rPr>
-          <w:rFonts w:ascii="Times New Roman" w:hAnsi="Times New Roman" w:cs="Times New Roman"/>
-          <w:b/>
-          <w:bCs/>
-          <w:sz w:val="20"/>
-          <w:szCs w:val="20"/>
-        </w:rPr>
-        <w:t>Passo 3 – Validar o resultado</w:t>
+          <w:sz w:val="20"/>
+          <w:szCs w:val="20"/>
+        </w:rPr>
+      </w:pPr>
+      <w:r>
+        <w:rPr>
+          <w:rFonts w:ascii="Times New Roman" w:hAnsi="Times New Roman" w:cs="Times New Roman"/>
+          <w:sz w:val="20"/>
+          <w:szCs w:val="20"/>
+        </w:rPr>
+        <w:t>Passo 4 – Evoluir para os 10 anos</w:t>
       </w:r>
     </w:p>
     <w:p>
       <w:pPr>
+        <w:rPr>
+          <w:rFonts w:ascii="Times New Roman" w:hAnsi="Times New Roman" w:cs="Times New Roman"/>
+          <w:sz w:val="20"/>
+          <w:szCs w:val="20"/>
+        </w:rPr>
+      </w:pPr>
+      <w:r>
+        <w:rPr>
+          <w:rFonts w:ascii="Times New Roman" w:hAnsi="Times New Roman" w:cs="Times New Roman"/>
+          <w:sz w:val="20"/>
+          <w:szCs w:val="20"/>
+        </w:rPr>
+        <w:t>Quando esse fluxo estiver funcionando para 2015, o próximo passo será:</w:t>
+      </w:r>
+    </w:p>
+    <w:p>
+      <w:pPr>
+        <w:pStyle w:val="PargrafodaLista"/>
         <w:numPr>
           <w:ilvl w:val="0"/>
-          <w:numId w:val="18"/>
+          <w:numId w:val="29"/>
         </w:numPr>
-        <w:rPr>
-          <w:rFonts w:ascii="Times New Roman" w:hAnsi="Times New Roman" w:cs="Times New Roman"/>
-          <w:b/>
-          <w:bCs/>
-          <w:sz w:val="20"/>
-          <w:szCs w:val="20"/>
-        </w:rPr>
-      </w:pPr>
-      <w:r>
-        <w:rPr>
-          <w:rFonts w:ascii="Times New Roman" w:hAnsi="Times New Roman" w:cs="Times New Roman"/>
-          <w:b/>
-          <w:bCs/>
-          <w:sz w:val="20"/>
-          <w:szCs w:val="20"/>
-        </w:rPr>
-        <w:t>Abrir o CSV de saída na </w:t>
+        <w:spacing w:after="0"/>
+        <w:rPr>
+          <w:rFonts w:ascii="Times New Roman" w:hAnsi="Times New Roman" w:cs="Times New Roman"/>
+          <w:sz w:val="20"/>
+          <w:szCs w:val="20"/>
+        </w:rPr>
+      </w:pPr>
+      <w:r>
+        <w:rPr>
+          <w:rFonts w:ascii="Times New Roman" w:hAnsi="Times New Roman" w:cs="Times New Roman"/>
+          <w:sz w:val="20"/>
+          <w:szCs w:val="20"/>
+        </w:rPr>
+        <w:t>Colocar todos os arquivos chegadas_2016.csv … chegadas_2024.csv na </w:t>
       </w:r>
       <w:proofErr w:type="spellStart"/>
       <w:r>
         <w:rPr>
           <w:rFonts w:ascii="Times New Roman" w:hAnsi="Times New Roman" w:cs="Times New Roman"/>
-          <w:b/>
-          <w:bCs/>
-          <w:sz w:val="20"/>
-          <w:szCs w:val="20"/>
-        </w:rPr>
-        <w:t>camada_stage</w:t>
+          <w:sz w:val="20"/>
+          <w:szCs w:val="20"/>
+        </w:rPr>
+        <w:t>camada_raw</w:t>
       </w:r>
       <w:proofErr w:type="spellEnd"/>
       <w:r>
         <w:rPr>
           <w:rFonts w:ascii="Times New Roman" w:hAnsi="Times New Roman" w:cs="Times New Roman"/>
-          <w:b/>
-          <w:bCs/>
-          <w:sz w:val="20"/>
-          <w:szCs w:val="20"/>
-        </w:rPr>
-        <w:t> e conferir se as colunas estão com nomes certinhos e se a contagem de linhas faz sentido.​</w:t>
+          <w:sz w:val="20"/>
+          <w:szCs w:val="20"/>
+        </w:rPr>
+        <w:t>.</w:t>
       </w:r>
     </w:p>
     <w:p>
       <w:pPr>
+        <w:pStyle w:val="PargrafodaLista"/>
         <w:numPr>
           <w:ilvl w:val="0"/>
-          <w:numId w:val="18"/>
+          <w:numId w:val="29"/>
         </w:numPr>
-        <w:rPr>
-          <w:rFonts w:ascii="Times New Roman" w:hAnsi="Times New Roman" w:cs="Times New Roman"/>
-          <w:b/>
-          <w:bCs/>
-          <w:sz w:val="20"/>
-          <w:szCs w:val="20"/>
-        </w:rPr>
-      </w:pPr>
-      <w:r>
-        <w:rPr>
-          <w:rFonts w:ascii="Times New Roman" w:hAnsi="Times New Roman" w:cs="Times New Roman"/>
-          <w:b/>
-          <w:bCs/>
-          <w:sz w:val="20"/>
-          <w:szCs w:val="20"/>
-        </w:rPr>
-        <w:t>Fazer testes simples em Python, como somar todas as chegadas de 2015 (</w:t>
-      </w:r>
-      <w:proofErr w:type="spellStart"/>
-      <w:r>
-        <w:rPr>
-          <w:rFonts w:ascii="Times New Roman" w:hAnsi="Times New Roman" w:cs="Times New Roman"/>
-          <w:b/>
-          <w:bCs/>
-          <w:sz w:val="20"/>
-          <w:szCs w:val="20"/>
-        </w:rPr>
-        <w:t>df</w:t>
-      </w:r>
-      <w:proofErr w:type="spellEnd"/>
-      <w:r>
-        <w:rPr>
-          <w:rFonts w:ascii="Times New Roman" w:hAnsi="Times New Roman" w:cs="Times New Roman"/>
-          <w:b/>
-          <w:bCs/>
-          <w:sz w:val="20"/>
-          <w:szCs w:val="20"/>
-        </w:rPr>
-        <w:t>['chegadas'].sum()) para ver se o dado parece razoável.​</w:t>
+        <w:spacing w:after="0"/>
+        <w:rPr>
+          <w:rFonts w:ascii="Times New Roman" w:hAnsi="Times New Roman" w:cs="Times New Roman"/>
+          <w:sz w:val="20"/>
+          <w:szCs w:val="20"/>
+        </w:rPr>
+      </w:pPr>
+      <w:r>
+        <w:rPr>
+          <w:rFonts w:ascii="Times New Roman" w:hAnsi="Times New Roman" w:cs="Times New Roman"/>
+          <w:sz w:val="20"/>
+          <w:szCs w:val="20"/>
+        </w:rPr>
+        <w:t>Adaptar o código para percorrer uma lista de anos, repetindo extrair → transformar → carregar para cada arquivo.​</w:t>
       </w:r>
     </w:p>
     <w:p>
       <w:pPr>
-        <w:rPr>
-          <w:rFonts w:ascii="Times New Roman" w:hAnsi="Times New Roman" w:cs="Times New Roman"/>
-          <w:b/>
-          <w:bCs/>
-          <w:sz w:val="20"/>
-          <w:szCs w:val="20"/>
-        </w:rPr>
-      </w:pPr>
-      <w:r>
-        <w:rPr>
-          <w:rFonts w:ascii="Times New Roman" w:hAnsi="Times New Roman" w:cs="Times New Roman"/>
-          <w:b/>
-          <w:bCs/>
-          <w:sz w:val="20"/>
-          <w:szCs w:val="20"/>
-        </w:rPr>
-        <w:t>Passo 4 – Evoluir para os 10 anos</w:t>
+        <w:pStyle w:val="PargrafodaLista"/>
+        <w:numPr>
+          <w:ilvl w:val="0"/>
+          <w:numId w:val="29"/>
+        </w:numPr>
+        <w:spacing w:after="0"/>
+        <w:rPr>
+          <w:rFonts w:ascii="Times New Roman" w:hAnsi="Times New Roman" w:cs="Times New Roman"/>
+          <w:sz w:val="20"/>
+          <w:szCs w:val="20"/>
+        </w:rPr>
+      </w:pPr>
+      <w:r>
+        <w:rPr>
+          <w:rFonts w:ascii="Times New Roman" w:hAnsi="Times New Roman" w:cs="Times New Roman"/>
+          <w:sz w:val="20"/>
+          <w:szCs w:val="20"/>
+        </w:rPr>
+        <w:t>S</w:t>
+      </w:r>
+      <w:r>
+        <w:rPr>
+          <w:rFonts w:ascii="Times New Roman" w:hAnsi="Times New Roman" w:cs="Times New Roman"/>
+          <w:sz w:val="20"/>
+          <w:szCs w:val="20"/>
+        </w:rPr>
+        <w:t>omar e agrupar chegadas</w:t>
       </w:r>
     </w:p>
     <w:p>
       <w:pPr>
-        <w:rPr>
-          <w:rFonts w:ascii="Times New Roman" w:hAnsi="Times New Roman" w:cs="Times New Roman"/>
-          <w:b/>
-          <w:bCs/>
-          <w:sz w:val="20"/>
-          <w:szCs w:val="20"/>
-        </w:rPr>
-      </w:pPr>
-      <w:r>
-        <w:rPr>
-          <w:rFonts w:ascii="Times New Roman" w:hAnsi="Times New Roman" w:cs="Times New Roman"/>
-          <w:b/>
-          <w:bCs/>
-          <w:sz w:val="20"/>
-          <w:szCs w:val="20"/>
-        </w:rPr>
-        <w:t>Quando esse fluxo estiver funcionando para 2015, o próximo passo será:</w:t>
+        <w:pStyle w:val="PargrafodaLista"/>
+        <w:numPr>
+          <w:ilvl w:val="0"/>
+          <w:numId w:val="29"/>
+        </w:numPr>
+        <w:spacing w:after="0"/>
+        <w:rPr>
+          <w:rFonts w:ascii="Times New Roman" w:hAnsi="Times New Roman" w:cs="Times New Roman"/>
+          <w:sz w:val="20"/>
+          <w:szCs w:val="20"/>
+        </w:rPr>
+      </w:pPr>
+      <w:r>
+        <w:rPr>
+          <w:rFonts w:ascii="Times New Roman" w:hAnsi="Times New Roman" w:cs="Times New Roman"/>
+          <w:sz w:val="20"/>
+          <w:szCs w:val="20"/>
+        </w:rPr>
+        <w:t>Ler todos os arquivos já tratados da </w:t>
+      </w:r>
+      <w:proofErr w:type="spellStart"/>
+      <w:r>
+        <w:rPr>
+          <w:rFonts w:ascii="Times New Roman" w:hAnsi="Times New Roman" w:cs="Times New Roman"/>
+          <w:sz w:val="20"/>
+          <w:szCs w:val="20"/>
+        </w:rPr>
+        <w:t>camada_stage</w:t>
+      </w:r>
+      <w:proofErr w:type="spellEnd"/>
+      <w:r>
+        <w:rPr>
+          <w:rFonts w:ascii="Times New Roman" w:hAnsi="Times New Roman" w:cs="Times New Roman"/>
+          <w:sz w:val="20"/>
+          <w:szCs w:val="20"/>
+        </w:rPr>
+        <w:t xml:space="preserve"> e concatenar em um único </w:t>
+      </w:r>
+      <w:proofErr w:type="spellStart"/>
+      <w:r>
+        <w:rPr>
+          <w:rFonts w:ascii="Times New Roman" w:hAnsi="Times New Roman" w:cs="Times New Roman"/>
+          <w:sz w:val="20"/>
+          <w:szCs w:val="20"/>
+        </w:rPr>
+        <w:t>DataFrame</w:t>
+      </w:r>
+      <w:proofErr w:type="spellEnd"/>
+      <w:r>
+        <w:rPr>
+          <w:rFonts w:ascii="Times New Roman" w:hAnsi="Times New Roman" w:cs="Times New Roman"/>
+          <w:sz w:val="20"/>
+          <w:szCs w:val="20"/>
+        </w:rPr>
+        <w:t>.</w:t>
       </w:r>
     </w:p>
     <w:p>
       <w:pPr>
+        <w:pStyle w:val="PargrafodaLista"/>
         <w:numPr>
           <w:ilvl w:val="0"/>
-          <w:numId w:val="19"/>
+          <w:numId w:val="29"/>
         </w:numPr>
-        <w:rPr>
-          <w:rFonts w:ascii="Times New Roman" w:hAnsi="Times New Roman" w:cs="Times New Roman"/>
-          <w:b/>
-          <w:bCs/>
-          <w:sz w:val="20"/>
-          <w:szCs w:val="20"/>
-        </w:rPr>
-      </w:pPr>
-      <w:r>
-        <w:rPr>
-          <w:rFonts w:ascii="Times New Roman" w:hAnsi="Times New Roman" w:cs="Times New Roman"/>
-          <w:b/>
-          <w:bCs/>
-          <w:sz w:val="20"/>
-          <w:szCs w:val="20"/>
-        </w:rPr>
-        <w:t>Colocar todos os arquivos chegadas_2016.csv … chegadas_2024.csv na </w:t>
-      </w:r>
-      <w:proofErr w:type="spellStart"/>
-      <w:r>
-        <w:rPr>
-          <w:rFonts w:ascii="Times New Roman" w:hAnsi="Times New Roman" w:cs="Times New Roman"/>
-          <w:b/>
-          <w:bCs/>
-          <w:sz w:val="20"/>
-          <w:szCs w:val="20"/>
-        </w:rPr>
-        <w:t>camada_raw</w:t>
-      </w:r>
-      <w:proofErr w:type="spellEnd"/>
-      <w:r>
-        <w:rPr>
-          <w:rFonts w:ascii="Times New Roman" w:hAnsi="Times New Roman" w:cs="Times New Roman"/>
-          <w:b/>
-          <w:bCs/>
-          <w:sz w:val="20"/>
-          <w:szCs w:val="20"/>
-        </w:rPr>
-        <w:t>.</w:t>
+        <w:spacing w:after="0"/>
+        <w:rPr>
+          <w:rFonts w:ascii="Times New Roman" w:hAnsi="Times New Roman" w:cs="Times New Roman"/>
+          <w:sz w:val="20"/>
+          <w:szCs w:val="20"/>
+        </w:rPr>
+      </w:pPr>
+      <w:r>
+        <w:rPr>
+          <w:rFonts w:ascii="Times New Roman" w:hAnsi="Times New Roman" w:cs="Times New Roman"/>
+          <w:sz w:val="20"/>
+          <w:szCs w:val="20"/>
+        </w:rPr>
+        <w:t>Criar funções para:</w:t>
       </w:r>
     </w:p>
     <w:p>
       <w:pPr>
+        <w:pStyle w:val="PargrafodaLista"/>
         <w:numPr>
           <w:ilvl w:val="0"/>
-          <w:numId w:val="19"/>
+          <w:numId w:val="30"/>
         </w:numPr>
         <w:rPr>
           <w:rFonts w:ascii="Times New Roman" w:hAnsi="Times New Roman" w:cs="Times New Roman"/>
-          <w:b/>
-          <w:bCs/>
-          <w:sz w:val="20"/>
-          <w:szCs w:val="20"/>
-        </w:rPr>
-      </w:pPr>
-      <w:r>
-        <w:rPr>
-          <w:rFonts w:ascii="Times New Roman" w:hAnsi="Times New Roman" w:cs="Times New Roman"/>
-          <w:b/>
-          <w:bCs/>
-          <w:sz w:val="20"/>
-          <w:szCs w:val="20"/>
-        </w:rPr>
-        <w:t>Adaptar o código para percorrer uma lista de anos, repetindo extrair → transformar → carregar para cada arquivo.​</w:t>
+          <w:sz w:val="20"/>
+          <w:szCs w:val="20"/>
+        </w:rPr>
+      </w:pPr>
+      <w:r>
+        <w:rPr>
+          <w:rFonts w:ascii="Times New Roman" w:hAnsi="Times New Roman" w:cs="Times New Roman"/>
+          <w:sz w:val="20"/>
+          <w:szCs w:val="20"/>
+        </w:rPr>
+        <w:t>Somar chegadas por ano.</w:t>
       </w:r>
     </w:p>
     <w:p>
       <w:pPr>
-        <w:rPr>
-          <w:rFonts w:ascii="Times New Roman" w:hAnsi="Times New Roman" w:cs="Times New Roman"/>
-          <w:sz w:val="20"/>
-          <w:szCs w:val="20"/>
-        </w:rPr>
-      </w:pPr>
-      <w:r>
-        <w:rPr>
-          <w:rFonts w:ascii="Times New Roman" w:hAnsi="Times New Roman" w:cs="Times New Roman"/>
-          <w:sz w:val="20"/>
-          <w:szCs w:val="20"/>
-        </w:rPr>
-        <w:br w:type="page"/>
+        <w:pStyle w:val="PargrafodaLista"/>
+        <w:numPr>
+          <w:ilvl w:val="0"/>
+          <w:numId w:val="30"/>
+        </w:numPr>
+        <w:rPr>
+          <w:rFonts w:ascii="Times New Roman" w:hAnsi="Times New Roman" w:cs="Times New Roman"/>
+          <w:sz w:val="20"/>
+          <w:szCs w:val="20"/>
+        </w:rPr>
+      </w:pPr>
+      <w:r>
+        <w:rPr>
+          <w:rFonts w:ascii="Times New Roman" w:hAnsi="Times New Roman" w:cs="Times New Roman"/>
+          <w:sz w:val="20"/>
+          <w:szCs w:val="20"/>
+        </w:rPr>
+        <w:t>Somar chegadas por país e ano.</w:t>
       </w:r>
     </w:p>
     <w:p>
       <w:pPr>
+        <w:pStyle w:val="PargrafodaLista"/>
+        <w:numPr>
+          <w:ilvl w:val="0"/>
+          <w:numId w:val="30"/>
+        </w:numPr>
+        <w:rPr>
+          <w:rFonts w:ascii="Times New Roman" w:hAnsi="Times New Roman" w:cs="Times New Roman"/>
+          <w:sz w:val="20"/>
+          <w:szCs w:val="20"/>
+        </w:rPr>
+      </w:pPr>
+      <w:r>
+        <w:rPr>
+          <w:rFonts w:ascii="Times New Roman" w:hAnsi="Times New Roman" w:cs="Times New Roman"/>
+          <w:sz w:val="20"/>
+          <w:szCs w:val="20"/>
+        </w:rPr>
+        <w:t>Somar chegadas por UF e ano.</w:t>
+      </w:r>
+    </w:p>
+    <w:p>
+      <w:pPr>
+        <w:pStyle w:val="PargrafodaLista"/>
+        <w:numPr>
+          <w:ilvl w:val="0"/>
+          <w:numId w:val="30"/>
+        </w:numPr>
+        <w:rPr>
+          <w:rFonts w:ascii="Times New Roman" w:hAnsi="Times New Roman" w:cs="Times New Roman"/>
+          <w:sz w:val="20"/>
+          <w:szCs w:val="20"/>
+        </w:rPr>
+      </w:pPr>
+      <w:r>
+        <w:rPr>
+          <w:rFonts w:ascii="Times New Roman" w:hAnsi="Times New Roman" w:cs="Times New Roman"/>
+          <w:sz w:val="20"/>
+          <w:szCs w:val="20"/>
+        </w:rPr>
+        <w:t xml:space="preserve">Salvar cada resultado em </w:t>
+      </w:r>
+      <w:proofErr w:type="spellStart"/>
+      <w:r>
+        <w:rPr>
+          <w:rFonts w:ascii="Times New Roman" w:hAnsi="Times New Roman" w:cs="Times New Roman"/>
+          <w:sz w:val="20"/>
+          <w:szCs w:val="20"/>
+        </w:rPr>
+        <w:t>CSVs</w:t>
+      </w:r>
+      <w:proofErr w:type="spellEnd"/>
+      <w:r>
+        <w:rPr>
+          <w:rFonts w:ascii="Times New Roman" w:hAnsi="Times New Roman" w:cs="Times New Roman"/>
+          <w:sz w:val="20"/>
+          <w:szCs w:val="20"/>
+        </w:rPr>
+        <w:t xml:space="preserve"> separados em uma </w:t>
+      </w:r>
+      <w:r>
+        <w:rPr>
+          <w:rFonts w:ascii="Times New Roman" w:hAnsi="Times New Roman" w:cs="Times New Roman"/>
+          <w:sz w:val="20"/>
+          <w:szCs w:val="20"/>
+        </w:rPr>
+        <w:t>p</w:t>
+      </w:r>
+      <w:r>
+        <w:rPr>
+          <w:rFonts w:ascii="Times New Roman" w:hAnsi="Times New Roman" w:cs="Times New Roman"/>
+          <w:sz w:val="20"/>
+          <w:szCs w:val="20"/>
+        </w:rPr>
+        <w:t>asta camada_final (ex.: fato_chegadas_ano.csv, fato_chegadas_pais_ano.csv).​</w:t>
+      </w:r>
+    </w:p>
+    <w:p>
+      <w:pPr>
+        <w:rPr>
+          <w:rFonts w:ascii="Times New Roman" w:hAnsi="Times New Roman" w:cs="Times New Roman"/>
+          <w:sz w:val="20"/>
+          <w:szCs w:val="20"/>
+        </w:rPr>
+      </w:pPr>
+      <w:r>
+        <w:rPr>
+          <w:rFonts w:ascii="Times New Roman" w:hAnsi="Times New Roman" w:cs="Times New Roman"/>
+          <w:sz w:val="20"/>
+          <w:szCs w:val="20"/>
+        </w:rPr>
+        <w:br/>
+      </w:r>
+    </w:p>
+    <w:p>
+      <w:pPr>
+        <w:rPr>
+          <w:rFonts w:ascii="Times New Roman" w:hAnsi="Times New Roman" w:cs="Times New Roman"/>
+          <w:sz w:val="20"/>
+          <w:szCs w:val="20"/>
+        </w:rPr>
+      </w:pPr>
+      <w:r>
+        <w:rPr>
+          <w:rFonts w:ascii="Times New Roman" w:hAnsi="Times New Roman" w:cs="Times New Roman"/>
+          <w:sz w:val="20"/>
+          <w:szCs w:val="20"/>
+        </w:rPr>
+        <w:br w:type="page"/>
+      </w:r>
+    </w:p>
+    <w:p>
+      <w:pPr>
         <w:rPr>
           <w:rFonts w:ascii="Times New Roman" w:hAnsi="Times New Roman" w:cs="Times New Roman"/>
           <w:sz w:val="20"/>
@@ -937,16 +979,89 @@
           <w:szCs w:val="20"/>
         </w:rPr>
         <w:lastRenderedPageBreak/>
-        <w:t>1. Somar e agrupar chegadas</w:t>
-      </w:r>
-      <w:r>
-        <w:rPr>
-          <w:rFonts w:ascii="Times New Roman" w:hAnsi="Times New Roman" w:cs="Times New Roman"/>
-          <w:sz w:val="20"/>
-          <w:szCs w:val="20"/>
-        </w:rPr>
-        <w:br/>
-        <w:t>Ler todos os arquivos já tratados da </w:t>
+        <w:t>Projeto para uso em Power BI</w:t>
+      </w:r>
+    </w:p>
+    <w:p>
+      <w:pPr>
+        <w:pStyle w:val="PargrafodaLista"/>
+        <w:numPr>
+          <w:ilvl w:val="0"/>
+          <w:numId w:val="32"/>
+        </w:numPr>
+        <w:rPr>
+          <w:rFonts w:ascii="Times New Roman" w:hAnsi="Times New Roman" w:cs="Times New Roman"/>
+          <w:sz w:val="20"/>
+          <w:szCs w:val="20"/>
+        </w:rPr>
+      </w:pPr>
+      <w:r>
+        <w:rPr>
+          <w:rFonts w:ascii="Times New Roman" w:hAnsi="Times New Roman" w:cs="Times New Roman"/>
+          <w:sz w:val="20"/>
+          <w:szCs w:val="20"/>
+        </w:rPr>
+        <w:t>Criar dimensões principais</w:t>
+      </w:r>
+    </w:p>
+    <w:p>
+      <w:pPr>
+        <w:rPr>
+          <w:rFonts w:ascii="Times New Roman" w:hAnsi="Times New Roman" w:cs="Times New Roman"/>
+          <w:sz w:val="20"/>
+          <w:szCs w:val="20"/>
+        </w:rPr>
+      </w:pPr>
+      <w:r>
+        <w:rPr>
+          <w:rFonts w:ascii="Times New Roman" w:hAnsi="Times New Roman" w:cs="Times New Roman"/>
+          <w:sz w:val="20"/>
+          <w:szCs w:val="20"/>
+        </w:rPr>
+        <w:t>Usando o arquivo tratado (ou a base concatenada), montar tabelas de dimensão para usar depois no Power BI:</w:t>
+      </w:r>
+    </w:p>
+    <w:p>
+      <w:pPr>
+        <w:numPr>
+          <w:ilvl w:val="0"/>
+          <w:numId w:val="20"/>
+        </w:numPr>
+        <w:rPr>
+          <w:rFonts w:ascii="Times New Roman" w:hAnsi="Times New Roman" w:cs="Times New Roman"/>
+          <w:sz w:val="20"/>
+          <w:szCs w:val="20"/>
+        </w:rPr>
+      </w:pPr>
+      <w:r>
+        <w:rPr>
+          <w:rFonts w:ascii="Times New Roman" w:hAnsi="Times New Roman" w:cs="Times New Roman"/>
+          <w:sz w:val="20"/>
+          <w:szCs w:val="20"/>
+        </w:rPr>
+        <w:t>Dimensão país:</w:t>
+      </w:r>
+    </w:p>
+    <w:p>
+      <w:pPr>
+        <w:numPr>
+          <w:ilvl w:val="1"/>
+          <w:numId w:val="20"/>
+        </w:numPr>
+        <w:spacing w:after="0"/>
+        <w:rPr>
+          <w:rFonts w:ascii="Times New Roman" w:hAnsi="Times New Roman" w:cs="Times New Roman"/>
+          <w:sz w:val="20"/>
+          <w:szCs w:val="20"/>
+        </w:rPr>
+      </w:pPr>
+      <w:r>
+        <w:rPr>
+          <w:rFonts w:ascii="Times New Roman" w:hAnsi="Times New Roman" w:cs="Times New Roman"/>
+          <w:sz w:val="20"/>
+          <w:szCs w:val="20"/>
+        </w:rPr>
+        <w:t xml:space="preserve">Colunas: </w:t>
       </w:r>
       <w:proofErr w:type="spellStart"/>
       <w:r>
@@ -955,7 +1070,7 @@
           <w:sz w:val="20"/>
           <w:szCs w:val="20"/>
         </w:rPr>
-        <w:t>camada_stage</w:t>
+        <w:t>id_pais</w:t>
       </w:r>
       <w:proofErr w:type="spellEnd"/>
       <w:r>
@@ -964,7 +1079,7 @@
           <w:sz w:val="20"/>
           <w:szCs w:val="20"/>
         </w:rPr>
-        <w:t xml:space="preserve"> e concatenar em um único </w:t>
+        <w:t xml:space="preserve"> (chave inteira), pais, continente, </w:t>
       </w:r>
       <w:proofErr w:type="spellStart"/>
       <w:r>
@@ -973,7 +1088,7 @@
           <w:sz w:val="20"/>
           <w:szCs w:val="20"/>
         </w:rPr>
-        <w:t>DataFrame</w:t>
+        <w:t>ordem_pais</w:t>
       </w:r>
       <w:proofErr w:type="spellEnd"/>
       <w:r>
@@ -982,52 +1097,47 @@
           <w:sz w:val="20"/>
           <w:szCs w:val="20"/>
         </w:rPr>
+        <w:t xml:space="preserve">, </w:t>
+      </w:r>
+      <w:proofErr w:type="spellStart"/>
+      <w:r>
+        <w:rPr>
+          <w:rFonts w:ascii="Times New Roman" w:hAnsi="Times New Roman" w:cs="Times New Roman"/>
+          <w:sz w:val="20"/>
+          <w:szCs w:val="20"/>
+        </w:rPr>
+        <w:t>ordem_continente</w:t>
+      </w:r>
+      <w:proofErr w:type="spellEnd"/>
+      <w:r>
+        <w:rPr>
+          <w:rFonts w:ascii="Times New Roman" w:hAnsi="Times New Roman" w:cs="Times New Roman"/>
+          <w:sz w:val="20"/>
+          <w:szCs w:val="20"/>
+        </w:rPr>
         <w:t>.</w:t>
       </w:r>
-      <w:r>
-        <w:rPr>
-          <w:rFonts w:ascii="Times New Roman" w:hAnsi="Times New Roman" w:cs="Times New Roman"/>
-          <w:sz w:val="20"/>
-          <w:szCs w:val="20"/>
-        </w:rPr>
-        <w:br/>
-        <w:t>Criar funções para:</w:t>
-      </w:r>
-      <w:r>
-        <w:rPr>
-          <w:rFonts w:ascii="Times New Roman" w:hAnsi="Times New Roman" w:cs="Times New Roman"/>
-          <w:sz w:val="20"/>
-          <w:szCs w:val="20"/>
-        </w:rPr>
-        <w:br/>
-        <w:t>Somar chegadas por ano.</w:t>
-      </w:r>
-      <w:r>
-        <w:rPr>
-          <w:rFonts w:ascii="Times New Roman" w:hAnsi="Times New Roman" w:cs="Times New Roman"/>
-          <w:sz w:val="20"/>
-          <w:szCs w:val="20"/>
-        </w:rPr>
-        <w:br/>
-        <w:t>Somar chegadas por país e ano.</w:t>
-      </w:r>
-      <w:r>
-        <w:rPr>
-          <w:rFonts w:ascii="Times New Roman" w:hAnsi="Times New Roman" w:cs="Times New Roman"/>
-          <w:sz w:val="20"/>
-          <w:szCs w:val="20"/>
-        </w:rPr>
-        <w:br/>
-        <w:t>Somar chegadas por UF e ano.</w:t>
-      </w:r>
-      <w:r>
-        <w:rPr>
-          <w:rFonts w:ascii="Times New Roman" w:hAnsi="Times New Roman" w:cs="Times New Roman"/>
-          <w:sz w:val="20"/>
-          <w:szCs w:val="20"/>
-        </w:rPr>
-        <w:br/>
-        <w:t xml:space="preserve">Salvar cada resultado em </w:t>
+    </w:p>
+    <w:p>
+      <w:pPr>
+        <w:numPr>
+          <w:ilvl w:val="1"/>
+          <w:numId w:val="20"/>
+        </w:numPr>
+        <w:spacing w:after="0"/>
+        <w:rPr>
+          <w:rFonts w:ascii="Times New Roman" w:hAnsi="Times New Roman" w:cs="Times New Roman"/>
+          <w:sz w:val="20"/>
+          <w:szCs w:val="20"/>
+        </w:rPr>
+      </w:pPr>
+      <w:r>
+        <w:rPr>
+          <w:rFonts w:ascii="Times New Roman" w:hAnsi="Times New Roman" w:cs="Times New Roman"/>
+          <w:sz w:val="20"/>
+          <w:szCs w:val="20"/>
+        </w:rPr>
+        <w:t>Remover duplicados de país e salvar em dim_pais.csv na </w:t>
       </w:r>
       <w:proofErr w:type="spellStart"/>
       <w:r>
@@ -1036,7 +1146,7 @@
           <w:sz w:val="20"/>
           <w:szCs w:val="20"/>
         </w:rPr>
-        <w:t>CSVs</w:t>
+        <w:t>camada_final</w:t>
       </w:r>
       <w:proofErr w:type="spellEnd"/>
       <w:r>
@@ -1045,9 +1155,713 @@
           <w:sz w:val="20"/>
           <w:szCs w:val="20"/>
         </w:rPr>
-        <w:t xml:space="preserve"> separados em uma pasta camada_final (ex.: fato_chegadas_ano.csv, fato_chegadas_pais_ano.csv).​</w:t>
+        <w:t>.​</w:t>
       </w:r>
     </w:p>
+    <w:p>
+      <w:pPr>
+        <w:numPr>
+          <w:ilvl w:val="0"/>
+          <w:numId w:val="20"/>
+        </w:numPr>
+        <w:rPr>
+          <w:rFonts w:ascii="Times New Roman" w:hAnsi="Times New Roman" w:cs="Times New Roman"/>
+          <w:sz w:val="20"/>
+          <w:szCs w:val="20"/>
+        </w:rPr>
+      </w:pPr>
+      <w:r>
+        <w:rPr>
+          <w:rFonts w:ascii="Times New Roman" w:hAnsi="Times New Roman" w:cs="Times New Roman"/>
+          <w:sz w:val="20"/>
+          <w:szCs w:val="20"/>
+        </w:rPr>
+        <w:t>Dimensão UF:</w:t>
+      </w:r>
+    </w:p>
+    <w:p>
+      <w:pPr>
+        <w:numPr>
+          <w:ilvl w:val="1"/>
+          <w:numId w:val="20"/>
+        </w:numPr>
+        <w:spacing w:after="0"/>
+        <w:rPr>
+          <w:rFonts w:ascii="Times New Roman" w:hAnsi="Times New Roman" w:cs="Times New Roman"/>
+          <w:sz w:val="20"/>
+          <w:szCs w:val="20"/>
+        </w:rPr>
+      </w:pPr>
+      <w:r>
+        <w:rPr>
+          <w:rFonts w:ascii="Times New Roman" w:hAnsi="Times New Roman" w:cs="Times New Roman"/>
+          <w:sz w:val="20"/>
+          <w:szCs w:val="20"/>
+        </w:rPr>
+        <w:t xml:space="preserve">Colunas: </w:t>
+      </w:r>
+      <w:proofErr w:type="spellStart"/>
+      <w:r>
+        <w:rPr>
+          <w:rFonts w:ascii="Times New Roman" w:hAnsi="Times New Roman" w:cs="Times New Roman"/>
+          <w:sz w:val="20"/>
+          <w:szCs w:val="20"/>
+        </w:rPr>
+        <w:t>id_uf</w:t>
+      </w:r>
+      <w:proofErr w:type="spellEnd"/>
+      <w:r>
+        <w:rPr>
+          <w:rFonts w:ascii="Times New Roman" w:hAnsi="Times New Roman" w:cs="Times New Roman"/>
+          <w:sz w:val="20"/>
+          <w:szCs w:val="20"/>
+        </w:rPr>
+        <w:t xml:space="preserve">, uf, </w:t>
+      </w:r>
+      <w:proofErr w:type="spellStart"/>
+      <w:r>
+        <w:rPr>
+          <w:rFonts w:ascii="Times New Roman" w:hAnsi="Times New Roman" w:cs="Times New Roman"/>
+          <w:sz w:val="20"/>
+          <w:szCs w:val="20"/>
+        </w:rPr>
+        <w:t>ordem_uf</w:t>
+      </w:r>
+      <w:proofErr w:type="spellEnd"/>
+      <w:r>
+        <w:rPr>
+          <w:rFonts w:ascii="Times New Roman" w:hAnsi="Times New Roman" w:cs="Times New Roman"/>
+          <w:sz w:val="20"/>
+          <w:szCs w:val="20"/>
+        </w:rPr>
+        <w:t>.</w:t>
+      </w:r>
+    </w:p>
+    <w:p>
+      <w:pPr>
+        <w:numPr>
+          <w:ilvl w:val="1"/>
+          <w:numId w:val="20"/>
+        </w:numPr>
+        <w:spacing w:after="0"/>
+        <w:rPr>
+          <w:rFonts w:ascii="Times New Roman" w:hAnsi="Times New Roman" w:cs="Times New Roman"/>
+          <w:sz w:val="20"/>
+          <w:szCs w:val="20"/>
+        </w:rPr>
+      </w:pPr>
+      <w:r>
+        <w:rPr>
+          <w:rFonts w:ascii="Times New Roman" w:hAnsi="Times New Roman" w:cs="Times New Roman"/>
+          <w:sz w:val="20"/>
+          <w:szCs w:val="20"/>
+        </w:rPr>
+        <w:t>Remover duplicados de UF e salvar em dim_uf.csv.​</w:t>
+      </w:r>
+    </w:p>
+    <w:p>
+      <w:pPr>
+        <w:numPr>
+          <w:ilvl w:val="0"/>
+          <w:numId w:val="20"/>
+        </w:numPr>
+        <w:rPr>
+          <w:rFonts w:ascii="Times New Roman" w:hAnsi="Times New Roman" w:cs="Times New Roman"/>
+          <w:sz w:val="20"/>
+          <w:szCs w:val="20"/>
+        </w:rPr>
+      </w:pPr>
+      <w:r>
+        <w:rPr>
+          <w:rFonts w:ascii="Times New Roman" w:hAnsi="Times New Roman" w:cs="Times New Roman"/>
+          <w:sz w:val="20"/>
+          <w:szCs w:val="20"/>
+        </w:rPr>
+        <w:t>Dimensão tempo:</w:t>
+      </w:r>
+    </w:p>
+    <w:p>
+      <w:pPr>
+        <w:numPr>
+          <w:ilvl w:val="1"/>
+          <w:numId w:val="20"/>
+        </w:numPr>
+        <w:spacing w:after="0"/>
+        <w:rPr>
+          <w:rFonts w:ascii="Times New Roman" w:hAnsi="Times New Roman" w:cs="Times New Roman"/>
+          <w:sz w:val="20"/>
+          <w:szCs w:val="20"/>
+        </w:rPr>
+      </w:pPr>
+      <w:r>
+        <w:rPr>
+          <w:rFonts w:ascii="Times New Roman" w:hAnsi="Times New Roman" w:cs="Times New Roman"/>
+          <w:sz w:val="20"/>
+          <w:szCs w:val="20"/>
+        </w:rPr>
+        <w:t xml:space="preserve">Colunas: ano, </w:t>
+      </w:r>
+      <w:proofErr w:type="spellStart"/>
+      <w:r>
+        <w:rPr>
+          <w:rFonts w:ascii="Times New Roman" w:hAnsi="Times New Roman" w:cs="Times New Roman"/>
+          <w:sz w:val="20"/>
+          <w:szCs w:val="20"/>
+        </w:rPr>
+        <w:t>mes</w:t>
+      </w:r>
+      <w:proofErr w:type="spellEnd"/>
+      <w:r>
+        <w:rPr>
+          <w:rFonts w:ascii="Times New Roman" w:hAnsi="Times New Roman" w:cs="Times New Roman"/>
+          <w:sz w:val="20"/>
+          <w:szCs w:val="20"/>
+        </w:rPr>
+        <w:t xml:space="preserve">, </w:t>
+      </w:r>
+      <w:proofErr w:type="spellStart"/>
+      <w:r>
+        <w:rPr>
+          <w:rFonts w:ascii="Times New Roman" w:hAnsi="Times New Roman" w:cs="Times New Roman"/>
+          <w:sz w:val="20"/>
+          <w:szCs w:val="20"/>
+        </w:rPr>
+        <w:t>ordem_mes</w:t>
+      </w:r>
+      <w:proofErr w:type="spellEnd"/>
+      <w:r>
+        <w:rPr>
+          <w:rFonts w:ascii="Times New Roman" w:hAnsi="Times New Roman" w:cs="Times New Roman"/>
+          <w:sz w:val="20"/>
+          <w:szCs w:val="20"/>
+        </w:rPr>
+        <w:t>.</w:t>
+      </w:r>
+    </w:p>
+    <w:p>
+      <w:pPr>
+        <w:numPr>
+          <w:ilvl w:val="1"/>
+          <w:numId w:val="20"/>
+        </w:numPr>
+        <w:spacing w:after="0"/>
+        <w:rPr>
+          <w:rFonts w:ascii="Times New Roman" w:hAnsi="Times New Roman" w:cs="Times New Roman"/>
+          <w:sz w:val="20"/>
+          <w:szCs w:val="20"/>
+        </w:rPr>
+      </w:pPr>
+      <w:r>
+        <w:rPr>
+          <w:rFonts w:ascii="Times New Roman" w:hAnsi="Times New Roman" w:cs="Times New Roman"/>
+          <w:sz w:val="20"/>
+          <w:szCs w:val="20"/>
+        </w:rPr>
+        <w:t>Remover duplicados de ano/mês e salvar em dim_tempo.csv.​</w:t>
+      </w:r>
+    </w:p>
+    <w:p>
+      <w:pPr>
+        <w:spacing w:after="0"/>
+        <w:ind w:left="1440"/>
+        <w:rPr>
+          <w:rFonts w:ascii="Times New Roman" w:hAnsi="Times New Roman" w:cs="Times New Roman"/>
+          <w:sz w:val="20"/>
+          <w:szCs w:val="20"/>
+        </w:rPr>
+      </w:pPr>
+    </w:p>
+    <w:p>
+      <w:pPr>
+        <w:rPr>
+          <w:rFonts w:ascii="Times New Roman" w:hAnsi="Times New Roman" w:cs="Times New Roman"/>
+          <w:sz w:val="20"/>
+          <w:szCs w:val="20"/>
+        </w:rPr>
+      </w:pPr>
+      <w:r>
+        <w:rPr>
+          <w:rFonts w:ascii="Times New Roman" w:hAnsi="Times New Roman" w:cs="Times New Roman"/>
+          <w:sz w:val="20"/>
+          <w:szCs w:val="20"/>
+        </w:rPr>
+        <w:t xml:space="preserve">Essas dimensões vão se relacionar com </w:t>
+      </w:r>
+      <w:proofErr w:type="gramStart"/>
+      <w:r>
+        <w:rPr>
+          <w:rFonts w:ascii="Times New Roman" w:hAnsi="Times New Roman" w:cs="Times New Roman"/>
+          <w:sz w:val="20"/>
+          <w:szCs w:val="20"/>
+        </w:rPr>
+        <w:t>as fatos</w:t>
+      </w:r>
+      <w:proofErr w:type="gramEnd"/>
+      <w:r>
+        <w:rPr>
+          <w:rFonts w:ascii="Times New Roman" w:hAnsi="Times New Roman" w:cs="Times New Roman"/>
+          <w:sz w:val="20"/>
+          <w:szCs w:val="20"/>
+        </w:rPr>
+        <w:t xml:space="preserve">: </w:t>
+      </w:r>
+    </w:p>
+    <w:p>
+      <w:pPr>
+        <w:rPr>
+          <w:rFonts w:ascii="Times New Roman" w:hAnsi="Times New Roman" w:cs="Times New Roman"/>
+          <w:sz w:val="20"/>
+          <w:szCs w:val="20"/>
+        </w:rPr>
+      </w:pPr>
+      <w:proofErr w:type="spellStart"/>
+      <w:r>
+        <w:rPr>
+          <w:rFonts w:ascii="Times New Roman" w:hAnsi="Times New Roman" w:cs="Times New Roman"/>
+          <w:sz w:val="20"/>
+          <w:szCs w:val="20"/>
+        </w:rPr>
+        <w:t>fato_chegadas_ano</w:t>
+      </w:r>
+      <w:proofErr w:type="spellEnd"/>
+      <w:r>
+        <w:rPr>
+          <w:rFonts w:ascii="Times New Roman" w:hAnsi="Times New Roman" w:cs="Times New Roman"/>
+          <w:sz w:val="20"/>
+          <w:szCs w:val="20"/>
+        </w:rPr>
+        <w:t xml:space="preserve">, </w:t>
+      </w:r>
+      <w:proofErr w:type="spellStart"/>
+      <w:r>
+        <w:rPr>
+          <w:rFonts w:ascii="Times New Roman" w:hAnsi="Times New Roman" w:cs="Times New Roman"/>
+          <w:sz w:val="20"/>
+          <w:szCs w:val="20"/>
+        </w:rPr>
+        <w:t>fato_chegadas_pais_ano</w:t>
+      </w:r>
+      <w:proofErr w:type="spellEnd"/>
+      <w:r>
+        <w:rPr>
+          <w:rFonts w:ascii="Times New Roman" w:hAnsi="Times New Roman" w:cs="Times New Roman"/>
+          <w:sz w:val="20"/>
+          <w:szCs w:val="20"/>
+        </w:rPr>
+        <w:t xml:space="preserve"> e </w:t>
+      </w:r>
+      <w:proofErr w:type="spellStart"/>
+      <w:r>
+        <w:rPr>
+          <w:rFonts w:ascii="Times New Roman" w:hAnsi="Times New Roman" w:cs="Times New Roman"/>
+          <w:sz w:val="20"/>
+          <w:szCs w:val="20"/>
+        </w:rPr>
+        <w:t>fato_chegadas_uf_ano</w:t>
+      </w:r>
+      <w:proofErr w:type="spellEnd"/>
+      <w:r>
+        <w:rPr>
+          <w:rFonts w:ascii="Times New Roman" w:hAnsi="Times New Roman" w:cs="Times New Roman"/>
+          <w:sz w:val="20"/>
+          <w:szCs w:val="20"/>
+        </w:rPr>
+        <w:t xml:space="preserve"> no modelo estrela.</w:t>
+      </w:r>
+    </w:p>
+    <w:p>
+      <w:pPr>
+        <w:pStyle w:val="PargrafodaLista"/>
+        <w:numPr>
+          <w:ilvl w:val="0"/>
+          <w:numId w:val="32"/>
+        </w:numPr>
+        <w:rPr>
+          <w:rFonts w:ascii="Times New Roman" w:hAnsi="Times New Roman" w:cs="Times New Roman"/>
+          <w:sz w:val="20"/>
+          <w:szCs w:val="20"/>
+        </w:rPr>
+      </w:pPr>
+      <w:r>
+        <w:rPr>
+          <w:rFonts w:ascii="Times New Roman" w:hAnsi="Times New Roman" w:cs="Times New Roman"/>
+          <w:sz w:val="20"/>
+          <w:szCs w:val="20"/>
+        </w:rPr>
+        <w:t>Validar consistência dos dados</w:t>
+      </w:r>
+    </w:p>
+    <w:p>
+      <w:pPr>
+        <w:numPr>
+          <w:ilvl w:val="0"/>
+          <w:numId w:val="21"/>
+        </w:numPr>
+        <w:spacing w:after="0"/>
+        <w:rPr>
+          <w:rFonts w:ascii="Times New Roman" w:hAnsi="Times New Roman" w:cs="Times New Roman"/>
+          <w:sz w:val="20"/>
+          <w:szCs w:val="20"/>
+        </w:rPr>
+      </w:pPr>
+      <w:r>
+        <w:rPr>
+          <w:rFonts w:ascii="Times New Roman" w:hAnsi="Times New Roman" w:cs="Times New Roman"/>
+          <w:sz w:val="20"/>
+          <w:szCs w:val="20"/>
+        </w:rPr>
+        <w:t xml:space="preserve">Conferir se todos os países que aparecem </w:t>
+      </w:r>
+      <w:proofErr w:type="gramStart"/>
+      <w:r>
+        <w:rPr>
+          <w:rFonts w:ascii="Times New Roman" w:hAnsi="Times New Roman" w:cs="Times New Roman"/>
+          <w:sz w:val="20"/>
+          <w:szCs w:val="20"/>
+        </w:rPr>
+        <w:t>nas fatos</w:t>
+      </w:r>
+      <w:proofErr w:type="gramEnd"/>
+      <w:r>
+        <w:rPr>
+          <w:rFonts w:ascii="Times New Roman" w:hAnsi="Times New Roman" w:cs="Times New Roman"/>
+          <w:sz w:val="20"/>
+          <w:szCs w:val="20"/>
+        </w:rPr>
+        <w:t xml:space="preserve"> existem em </w:t>
+      </w:r>
+      <w:proofErr w:type="spellStart"/>
+      <w:r>
+        <w:rPr>
+          <w:rFonts w:ascii="Times New Roman" w:hAnsi="Times New Roman" w:cs="Times New Roman"/>
+          <w:sz w:val="20"/>
+          <w:szCs w:val="20"/>
+        </w:rPr>
+        <w:t>dim_pais</w:t>
+      </w:r>
+      <w:proofErr w:type="spellEnd"/>
+      <w:r>
+        <w:rPr>
+          <w:rFonts w:ascii="Times New Roman" w:hAnsi="Times New Roman" w:cs="Times New Roman"/>
+          <w:sz w:val="20"/>
+          <w:szCs w:val="20"/>
+        </w:rPr>
+        <w:t> (mesmo para UF e tempo).​</w:t>
+      </w:r>
+    </w:p>
+    <w:p>
+      <w:pPr>
+        <w:numPr>
+          <w:ilvl w:val="0"/>
+          <w:numId w:val="21"/>
+        </w:numPr>
+        <w:spacing w:after="0"/>
+        <w:rPr>
+          <w:rFonts w:ascii="Times New Roman" w:hAnsi="Times New Roman" w:cs="Times New Roman"/>
+          <w:sz w:val="20"/>
+          <w:szCs w:val="20"/>
+        </w:rPr>
+      </w:pPr>
+      <w:r>
+        <w:rPr>
+          <w:rFonts w:ascii="Times New Roman" w:hAnsi="Times New Roman" w:cs="Times New Roman"/>
+          <w:sz w:val="20"/>
+          <w:szCs w:val="20"/>
+        </w:rPr>
+        <w:t>Procurar valores “Outros países”, “Países não especificados” e decidir se mantêm como categorias próprias ou se tratam de outra forma.​</w:t>
+      </w:r>
+    </w:p>
+    <w:p>
+      <w:pPr>
+        <w:spacing w:after="0"/>
+        <w:ind w:left="720"/>
+        <w:rPr>
+          <w:rFonts w:ascii="Times New Roman" w:hAnsi="Times New Roman" w:cs="Times New Roman"/>
+          <w:sz w:val="20"/>
+          <w:szCs w:val="20"/>
+        </w:rPr>
+      </w:pPr>
+    </w:p>
+    <w:p>
+      <w:pPr>
+        <w:pStyle w:val="PargrafodaLista"/>
+        <w:numPr>
+          <w:ilvl w:val="0"/>
+          <w:numId w:val="32"/>
+        </w:numPr>
+        <w:rPr>
+          <w:rFonts w:ascii="Times New Roman" w:hAnsi="Times New Roman" w:cs="Times New Roman"/>
+          <w:sz w:val="20"/>
+          <w:szCs w:val="20"/>
+        </w:rPr>
+      </w:pPr>
+      <w:r>
+        <w:rPr>
+          <w:rFonts w:ascii="Times New Roman" w:hAnsi="Times New Roman" w:cs="Times New Roman"/>
+          <w:sz w:val="20"/>
+          <w:szCs w:val="20"/>
+        </w:rPr>
+        <w:t>Preparar o modelo para o Power BI</w:t>
+      </w:r>
+    </w:p>
+    <w:p>
+      <w:pPr>
+        <w:rPr>
+          <w:rFonts w:ascii="Times New Roman" w:hAnsi="Times New Roman" w:cs="Times New Roman"/>
+          <w:sz w:val="20"/>
+          <w:szCs w:val="20"/>
+        </w:rPr>
+      </w:pPr>
+      <w:r>
+        <w:rPr>
+          <w:rFonts w:ascii="Times New Roman" w:hAnsi="Times New Roman" w:cs="Times New Roman"/>
+          <w:sz w:val="20"/>
+          <w:szCs w:val="20"/>
+        </w:rPr>
+        <w:t>Garantir que:</w:t>
+      </w:r>
+    </w:p>
+    <w:p>
+      <w:pPr>
+        <w:numPr>
+          <w:ilvl w:val="1"/>
+          <w:numId w:val="22"/>
+        </w:numPr>
+        <w:spacing w:after="0"/>
+        <w:rPr>
+          <w:rFonts w:ascii="Times New Roman" w:hAnsi="Times New Roman" w:cs="Times New Roman"/>
+          <w:sz w:val="20"/>
+          <w:szCs w:val="20"/>
+        </w:rPr>
+      </w:pPr>
+      <w:r>
+        <w:rPr>
+          <w:rFonts w:ascii="Times New Roman" w:hAnsi="Times New Roman" w:cs="Times New Roman"/>
+          <w:sz w:val="20"/>
+          <w:szCs w:val="20"/>
+        </w:rPr>
+        <w:t>Todas as chaves que vão ser usadas para relacionamento estejam com o mesmo tipo (por exemplo, ano inteiro em todas as tabelas).​</w:t>
+      </w:r>
+    </w:p>
+    <w:p>
+      <w:pPr>
+        <w:numPr>
+          <w:ilvl w:val="1"/>
+          <w:numId w:val="22"/>
+        </w:numPr>
+        <w:spacing w:after="0"/>
+        <w:rPr>
+          <w:rFonts w:ascii="Times New Roman" w:hAnsi="Times New Roman" w:cs="Times New Roman"/>
+          <w:sz w:val="20"/>
+          <w:szCs w:val="20"/>
+        </w:rPr>
+      </w:pPr>
+      <w:r>
+        <w:rPr>
+          <w:rFonts w:ascii="Times New Roman" w:hAnsi="Times New Roman" w:cs="Times New Roman"/>
+          <w:sz w:val="20"/>
+          <w:szCs w:val="20"/>
+        </w:rPr>
+        <w:t>Colunas de texto importantes (pais, uf, continente, </w:t>
+      </w:r>
+      <w:proofErr w:type="spellStart"/>
+      <w:r>
+        <w:rPr>
+          <w:rFonts w:ascii="Times New Roman" w:hAnsi="Times New Roman" w:cs="Times New Roman"/>
+          <w:sz w:val="20"/>
+          <w:szCs w:val="20"/>
+        </w:rPr>
+        <w:t>mes</w:t>
+      </w:r>
+      <w:proofErr w:type="spellEnd"/>
+      <w:r>
+        <w:rPr>
+          <w:rFonts w:ascii="Times New Roman" w:hAnsi="Times New Roman" w:cs="Times New Roman"/>
+          <w:sz w:val="20"/>
+          <w:szCs w:val="20"/>
+        </w:rPr>
+        <w:t>) estejam limpas e padronizadas (sem variações de acento ou caixa misturada).​</w:t>
+      </w:r>
+    </w:p>
+    <w:p>
+      <w:pPr>
+        <w:spacing w:after="0"/>
+        <w:ind w:left="1440"/>
+        <w:rPr>
+          <w:rFonts w:ascii="Times New Roman" w:hAnsi="Times New Roman" w:cs="Times New Roman"/>
+          <w:sz w:val="20"/>
+          <w:szCs w:val="20"/>
+        </w:rPr>
+      </w:pPr>
+    </w:p>
+    <w:p>
+      <w:pPr>
+        <w:rPr>
+          <w:rFonts w:ascii="Times New Roman" w:hAnsi="Times New Roman" w:cs="Times New Roman"/>
+          <w:sz w:val="20"/>
+          <w:szCs w:val="20"/>
+        </w:rPr>
+      </w:pPr>
+      <w:r>
+        <w:rPr>
+          <w:rFonts w:ascii="Times New Roman" w:hAnsi="Times New Roman" w:cs="Times New Roman"/>
+          <w:sz w:val="20"/>
+          <w:szCs w:val="20"/>
+        </w:rPr>
+        <w:t>Organizar a </w:t>
+      </w:r>
+      <w:proofErr w:type="spellStart"/>
+      <w:r>
+        <w:rPr>
+          <w:rFonts w:ascii="Times New Roman" w:hAnsi="Times New Roman" w:cs="Times New Roman"/>
+          <w:sz w:val="20"/>
+          <w:szCs w:val="20"/>
+        </w:rPr>
+        <w:t>camada_final</w:t>
+      </w:r>
+      <w:proofErr w:type="spellEnd"/>
+      <w:r>
+        <w:rPr>
+          <w:rFonts w:ascii="Times New Roman" w:hAnsi="Times New Roman" w:cs="Times New Roman"/>
+          <w:sz w:val="20"/>
+          <w:szCs w:val="20"/>
+        </w:rPr>
+        <w:t> com nomes de arquivos bem claros:</w:t>
+      </w:r>
+    </w:p>
+    <w:p>
+      <w:pPr>
+        <w:numPr>
+          <w:ilvl w:val="1"/>
+          <w:numId w:val="22"/>
+        </w:numPr>
+        <w:spacing w:after="0"/>
+        <w:rPr>
+          <w:rFonts w:ascii="Times New Roman" w:hAnsi="Times New Roman" w:cs="Times New Roman"/>
+          <w:sz w:val="20"/>
+          <w:szCs w:val="20"/>
+        </w:rPr>
+      </w:pPr>
+      <w:r>
+        <w:rPr>
+          <w:rFonts w:ascii="Times New Roman" w:hAnsi="Times New Roman" w:cs="Times New Roman"/>
+          <w:sz w:val="20"/>
+          <w:szCs w:val="20"/>
+        </w:rPr>
+        <w:t>fato_chegadas_ano.csv</w:t>
+      </w:r>
+    </w:p>
+    <w:p>
+      <w:pPr>
+        <w:numPr>
+          <w:ilvl w:val="1"/>
+          <w:numId w:val="22"/>
+        </w:numPr>
+        <w:spacing w:after="0"/>
+        <w:rPr>
+          <w:rFonts w:ascii="Times New Roman" w:hAnsi="Times New Roman" w:cs="Times New Roman"/>
+          <w:sz w:val="20"/>
+          <w:szCs w:val="20"/>
+        </w:rPr>
+      </w:pPr>
+      <w:r>
+        <w:rPr>
+          <w:rFonts w:ascii="Times New Roman" w:hAnsi="Times New Roman" w:cs="Times New Roman"/>
+          <w:sz w:val="20"/>
+          <w:szCs w:val="20"/>
+        </w:rPr>
+        <w:t>fato_chegadas_pais_ano.csv</w:t>
+      </w:r>
+    </w:p>
+    <w:p>
+      <w:pPr>
+        <w:numPr>
+          <w:ilvl w:val="1"/>
+          <w:numId w:val="22"/>
+        </w:numPr>
+        <w:spacing w:after="0"/>
+        <w:rPr>
+          <w:rFonts w:ascii="Times New Roman" w:hAnsi="Times New Roman" w:cs="Times New Roman"/>
+          <w:sz w:val="20"/>
+          <w:szCs w:val="20"/>
+        </w:rPr>
+      </w:pPr>
+      <w:r>
+        <w:rPr>
+          <w:rFonts w:ascii="Times New Roman" w:hAnsi="Times New Roman" w:cs="Times New Roman"/>
+          <w:sz w:val="20"/>
+          <w:szCs w:val="20"/>
+        </w:rPr>
+        <w:t>fato_chegadas_uf_ano.csv</w:t>
+      </w:r>
+    </w:p>
+    <w:p>
+      <w:pPr>
+        <w:numPr>
+          <w:ilvl w:val="1"/>
+          <w:numId w:val="22"/>
+        </w:numPr>
+        <w:spacing w:after="0"/>
+        <w:rPr>
+          <w:rFonts w:ascii="Times New Roman" w:hAnsi="Times New Roman" w:cs="Times New Roman"/>
+          <w:sz w:val="20"/>
+          <w:szCs w:val="20"/>
+        </w:rPr>
+      </w:pPr>
+      <w:r>
+        <w:rPr>
+          <w:rFonts w:ascii="Times New Roman" w:hAnsi="Times New Roman" w:cs="Times New Roman"/>
+          <w:sz w:val="20"/>
+          <w:szCs w:val="20"/>
+        </w:rPr>
+        <w:t>dim_pais.csv</w:t>
+      </w:r>
+    </w:p>
+    <w:p>
+      <w:pPr>
+        <w:numPr>
+          <w:ilvl w:val="1"/>
+          <w:numId w:val="22"/>
+        </w:numPr>
+        <w:spacing w:after="0"/>
+        <w:rPr>
+          <w:rFonts w:ascii="Times New Roman" w:hAnsi="Times New Roman" w:cs="Times New Roman"/>
+          <w:sz w:val="20"/>
+          <w:szCs w:val="20"/>
+        </w:rPr>
+      </w:pPr>
+      <w:r>
+        <w:rPr>
+          <w:rFonts w:ascii="Times New Roman" w:hAnsi="Times New Roman" w:cs="Times New Roman"/>
+          <w:sz w:val="20"/>
+          <w:szCs w:val="20"/>
+        </w:rPr>
+        <w:t>dim_uf.csv</w:t>
+      </w:r>
+    </w:p>
+    <w:p>
+      <w:pPr>
+        <w:numPr>
+          <w:ilvl w:val="1"/>
+          <w:numId w:val="22"/>
+        </w:numPr>
+        <w:spacing w:after="0"/>
+        <w:rPr>
+          <w:rFonts w:ascii="Times New Roman" w:hAnsi="Times New Roman" w:cs="Times New Roman"/>
+          <w:sz w:val="20"/>
+          <w:szCs w:val="20"/>
+        </w:rPr>
+      </w:pPr>
+      <w:r>
+        <w:rPr>
+          <w:rFonts w:ascii="Times New Roman" w:hAnsi="Times New Roman" w:cs="Times New Roman"/>
+          <w:sz w:val="20"/>
+          <w:szCs w:val="20"/>
+        </w:rPr>
+        <w:t>dim_tempo.csv</w:t>
+      </w:r>
+    </w:p>
+    <w:p/>
     <w:sectPr>
       <w:pgSz w:w="11906" w:h="16838"/>
       <w:pgMar w:top="1417" w:right="1701" w:bottom="1417" w:left="1701" w:header="708" w:footer="708" w:gutter="0"/>
@@ -1210,6 +2024,304 @@
     </w:lvl>
   </w:abstractNum>
   <w:abstractNum w:abstractNumId="1" w15:restartNumberingAfterBreak="0">
+    <w:nsid w:val="032C5115"/>
+    <w:multiLevelType w:val="multilevel"/>
+    <w:tmpl w:val="7FD480A4"/>
+    <w:lvl w:ilvl="0">
+      <w:start w:val="1"/>
+      <w:numFmt w:val="bullet"/>
+      <w:lvlText w:val=""/>
+      <w:lvlJc w:val="left"/>
+      <w:pPr>
+        <w:tabs>
+          <w:tab w:val="num" w:pos="720"/>
+        </w:tabs>
+        <w:ind w:left="720" w:hanging="360"/>
+      </w:pPr>
+      <w:rPr>
+        <w:rFonts w:ascii="Symbol" w:hAnsi="Symbol" w:hint="default"/>
+        <w:sz w:val="20"/>
+      </w:rPr>
+    </w:lvl>
+    <w:lvl w:ilvl="1">
+      <w:start w:val="1"/>
+      <w:numFmt w:val="bullet"/>
+      <w:lvlText w:val=""/>
+      <w:lvlJc w:val="left"/>
+      <w:pPr>
+        <w:tabs>
+          <w:tab w:val="num" w:pos="1440"/>
+        </w:tabs>
+        <w:ind w:left="1440" w:hanging="360"/>
+      </w:pPr>
+      <w:rPr>
+        <w:rFonts w:ascii="Symbol" w:hAnsi="Symbol" w:hint="default"/>
+        <w:sz w:val="20"/>
+      </w:rPr>
+    </w:lvl>
+    <w:lvl w:ilvl="2" w:tentative="1">
+      <w:start w:val="1"/>
+      <w:numFmt w:val="bullet"/>
+      <w:lvlText w:val=""/>
+      <w:lvlJc w:val="left"/>
+      <w:pPr>
+        <w:tabs>
+          <w:tab w:val="num" w:pos="2160"/>
+        </w:tabs>
+        <w:ind w:left="2160" w:hanging="360"/>
+      </w:pPr>
+      <w:rPr>
+        <w:rFonts w:ascii="Symbol" w:hAnsi="Symbol" w:hint="default"/>
+        <w:sz w:val="20"/>
+      </w:rPr>
+    </w:lvl>
+    <w:lvl w:ilvl="3" w:tentative="1">
+      <w:start w:val="1"/>
+      <w:numFmt w:val="bullet"/>
+      <w:lvlText w:val=""/>
+      <w:lvlJc w:val="left"/>
+      <w:pPr>
+        <w:tabs>
+          <w:tab w:val="num" w:pos="2880"/>
+        </w:tabs>
+        <w:ind w:left="2880" w:hanging="360"/>
+      </w:pPr>
+      <w:rPr>
+        <w:rFonts w:ascii="Symbol" w:hAnsi="Symbol" w:hint="default"/>
+        <w:sz w:val="20"/>
+      </w:rPr>
+    </w:lvl>
+    <w:lvl w:ilvl="4" w:tentative="1">
+      <w:start w:val="1"/>
+      <w:numFmt w:val="bullet"/>
+      <w:lvlText w:val=""/>
+      <w:lvlJc w:val="left"/>
+      <w:pPr>
+        <w:tabs>
+          <w:tab w:val="num" w:pos="3600"/>
+        </w:tabs>
+        <w:ind w:left="3600" w:hanging="360"/>
+      </w:pPr>
+      <w:rPr>
+        <w:rFonts w:ascii="Symbol" w:hAnsi="Symbol" w:hint="default"/>
+        <w:sz w:val="20"/>
+      </w:rPr>
+    </w:lvl>
+    <w:lvl w:ilvl="5" w:tentative="1">
+      <w:start w:val="1"/>
+      <w:numFmt w:val="bullet"/>
+      <w:lvlText w:val=""/>
+      <w:lvlJc w:val="left"/>
+      <w:pPr>
+        <w:tabs>
+          <w:tab w:val="num" w:pos="4320"/>
+        </w:tabs>
+        <w:ind w:left="4320" w:hanging="360"/>
+      </w:pPr>
+      <w:rPr>
+        <w:rFonts w:ascii="Symbol" w:hAnsi="Symbol" w:hint="default"/>
+        <w:sz w:val="20"/>
+      </w:rPr>
+    </w:lvl>
+    <w:lvl w:ilvl="6" w:tentative="1">
+      <w:start w:val="1"/>
+      <w:numFmt w:val="bullet"/>
+      <w:lvlText w:val=""/>
+      <w:lvlJc w:val="left"/>
+      <w:pPr>
+        <w:tabs>
+          <w:tab w:val="num" w:pos="5040"/>
+        </w:tabs>
+        <w:ind w:left="5040" w:hanging="360"/>
+      </w:pPr>
+      <w:rPr>
+        <w:rFonts w:ascii="Symbol" w:hAnsi="Symbol" w:hint="default"/>
+        <w:sz w:val="20"/>
+      </w:rPr>
+    </w:lvl>
+    <w:lvl w:ilvl="7" w:tentative="1">
+      <w:start w:val="1"/>
+      <w:numFmt w:val="bullet"/>
+      <w:lvlText w:val=""/>
+      <w:lvlJc w:val="left"/>
+      <w:pPr>
+        <w:tabs>
+          <w:tab w:val="num" w:pos="5760"/>
+        </w:tabs>
+        <w:ind w:left="5760" w:hanging="360"/>
+      </w:pPr>
+      <w:rPr>
+        <w:rFonts w:ascii="Symbol" w:hAnsi="Symbol" w:hint="default"/>
+        <w:sz w:val="20"/>
+      </w:rPr>
+    </w:lvl>
+    <w:lvl w:ilvl="8" w:tentative="1">
+      <w:start w:val="1"/>
+      <w:numFmt w:val="bullet"/>
+      <w:lvlText w:val=""/>
+      <w:lvlJc w:val="left"/>
+      <w:pPr>
+        <w:tabs>
+          <w:tab w:val="num" w:pos="6480"/>
+        </w:tabs>
+        <w:ind w:left="6480" w:hanging="360"/>
+      </w:pPr>
+      <w:rPr>
+        <w:rFonts w:ascii="Symbol" w:hAnsi="Symbol" w:hint="default"/>
+        <w:sz w:val="20"/>
+      </w:rPr>
+    </w:lvl>
+  </w:abstractNum>
+  <w:abstractNum w:abstractNumId="2" w15:restartNumberingAfterBreak="0">
+    <w:nsid w:val="080D7E5C"/>
+    <w:multiLevelType w:val="multilevel"/>
+    <w:tmpl w:val="AB823DDE"/>
+    <w:lvl w:ilvl="0">
+      <w:start w:val="1"/>
+      <w:numFmt w:val="bullet"/>
+      <w:lvlText w:val=""/>
+      <w:lvlJc w:val="left"/>
+      <w:pPr>
+        <w:tabs>
+          <w:tab w:val="num" w:pos="720"/>
+        </w:tabs>
+        <w:ind w:left="720" w:hanging="360"/>
+      </w:pPr>
+      <w:rPr>
+        <w:rFonts w:ascii="Symbol" w:hAnsi="Symbol" w:hint="default"/>
+        <w:sz w:val="20"/>
+      </w:rPr>
+    </w:lvl>
+    <w:lvl w:ilvl="1">
+      <w:start w:val="1"/>
+      <w:numFmt w:val="bullet"/>
+      <w:lvlText w:val=""/>
+      <w:lvlJc w:val="left"/>
+      <w:pPr>
+        <w:tabs>
+          <w:tab w:val="num" w:pos="1440"/>
+        </w:tabs>
+        <w:ind w:left="1440" w:hanging="360"/>
+      </w:pPr>
+      <w:rPr>
+        <w:rFonts w:ascii="Symbol" w:hAnsi="Symbol" w:hint="default"/>
+        <w:sz w:val="20"/>
+      </w:rPr>
+    </w:lvl>
+    <w:lvl w:ilvl="2" w:tentative="1">
+      <w:start w:val="1"/>
+      <w:numFmt w:val="bullet"/>
+      <w:lvlText w:val=""/>
+      <w:lvlJc w:val="left"/>
+      <w:pPr>
+        <w:tabs>
+          <w:tab w:val="num" w:pos="2160"/>
+        </w:tabs>
+        <w:ind w:left="2160" w:hanging="360"/>
+      </w:pPr>
+      <w:rPr>
+        <w:rFonts w:ascii="Symbol" w:hAnsi="Symbol" w:hint="default"/>
+        <w:sz w:val="20"/>
+      </w:rPr>
+    </w:lvl>
+    <w:lvl w:ilvl="3" w:tentative="1">
+      <w:start w:val="1"/>
+      <w:numFmt w:val="bullet"/>
+      <w:lvlText w:val=""/>
+      <w:lvlJc w:val="left"/>
+      <w:pPr>
+        <w:tabs>
+          <w:tab w:val="num" w:pos="2880"/>
+        </w:tabs>
+        <w:ind w:left="2880" w:hanging="360"/>
+      </w:pPr>
+      <w:rPr>
+        <w:rFonts w:ascii="Symbol" w:hAnsi="Symbol" w:hint="default"/>
+        <w:sz w:val="20"/>
+      </w:rPr>
+    </w:lvl>
+    <w:lvl w:ilvl="4" w:tentative="1">
+      <w:start w:val="1"/>
+      <w:numFmt w:val="bullet"/>
+      <w:lvlText w:val=""/>
+      <w:lvlJc w:val="left"/>
+      <w:pPr>
+        <w:tabs>
+          <w:tab w:val="num" w:pos="3600"/>
+        </w:tabs>
+        <w:ind w:left="3600" w:hanging="360"/>
+      </w:pPr>
+      <w:rPr>
+        <w:rFonts w:ascii="Symbol" w:hAnsi="Symbol" w:hint="default"/>
+        <w:sz w:val="20"/>
+      </w:rPr>
+    </w:lvl>
+    <w:lvl w:ilvl="5" w:tentative="1">
+      <w:start w:val="1"/>
+      <w:numFmt w:val="bullet"/>
+      <w:lvlText w:val=""/>
+      <w:lvlJc w:val="left"/>
+      <w:pPr>
+        <w:tabs>
+          <w:tab w:val="num" w:pos="4320"/>
+        </w:tabs>
+        <w:ind w:left="4320" w:hanging="360"/>
+      </w:pPr>
+      <w:rPr>
+        <w:rFonts w:ascii="Symbol" w:hAnsi="Symbol" w:hint="default"/>
+        <w:sz w:val="20"/>
+      </w:rPr>
+    </w:lvl>
+    <w:lvl w:ilvl="6" w:tentative="1">
+      <w:start w:val="1"/>
+      <w:numFmt w:val="bullet"/>
+      <w:lvlText w:val=""/>
+      <w:lvlJc w:val="left"/>
+      <w:pPr>
+        <w:tabs>
+          <w:tab w:val="num" w:pos="5040"/>
+        </w:tabs>
+        <w:ind w:left="5040" w:hanging="360"/>
+      </w:pPr>
+      <w:rPr>
+        <w:rFonts w:ascii="Symbol" w:hAnsi="Symbol" w:hint="default"/>
+        <w:sz w:val="20"/>
+      </w:rPr>
+    </w:lvl>
+    <w:lvl w:ilvl="7" w:tentative="1">
+      <w:start w:val="1"/>
+      <w:numFmt w:val="bullet"/>
+      <w:lvlText w:val=""/>
+      <w:lvlJc w:val="left"/>
+      <w:pPr>
+        <w:tabs>
+          <w:tab w:val="num" w:pos="5760"/>
+        </w:tabs>
+        <w:ind w:left="5760" w:hanging="360"/>
+      </w:pPr>
+      <w:rPr>
+        <w:rFonts w:ascii="Symbol" w:hAnsi="Symbol" w:hint="default"/>
+        <w:sz w:val="20"/>
+      </w:rPr>
+    </w:lvl>
+    <w:lvl w:ilvl="8" w:tentative="1">
+      <w:start w:val="1"/>
+      <w:numFmt w:val="bullet"/>
+      <w:lvlText w:val=""/>
+      <w:lvlJc w:val="left"/>
+      <w:pPr>
+        <w:tabs>
+          <w:tab w:val="num" w:pos="6480"/>
+        </w:tabs>
+        <w:ind w:left="6480" w:hanging="360"/>
+      </w:pPr>
+      <w:rPr>
+        <w:rFonts w:ascii="Symbol" w:hAnsi="Symbol" w:hint="default"/>
+        <w:sz w:val="20"/>
+      </w:rPr>
+    </w:lvl>
+  </w:abstractNum>
+  <w:abstractNum w:abstractNumId="3" w15:restartNumberingAfterBreak="0">
     <w:nsid w:val="08957794"/>
     <w:multiLevelType w:val="multilevel"/>
     <w:tmpl w:val="6742B95C"/>
@@ -1358,7 +2470,7 @@
       </w:rPr>
     </w:lvl>
   </w:abstractNum>
-  <w:abstractNum w:abstractNumId="2" w15:restartNumberingAfterBreak="0">
+  <w:abstractNum w:abstractNumId="4" w15:restartNumberingAfterBreak="0">
     <w:nsid w:val="14DC6C25"/>
     <w:multiLevelType w:val="multilevel"/>
     <w:tmpl w:val="191E1C84"/>
@@ -1507,7 +2619,7 @@
       </w:rPr>
     </w:lvl>
   </w:abstractNum>
-  <w:abstractNum w:abstractNumId="3" w15:restartNumberingAfterBreak="0">
+  <w:abstractNum w:abstractNumId="5" w15:restartNumberingAfterBreak="0">
     <w:nsid w:val="1D310D20"/>
     <w:multiLevelType w:val="multilevel"/>
     <w:tmpl w:val="788AD09E"/>
@@ -1656,7 +2768,7 @@
       </w:rPr>
     </w:lvl>
   </w:abstractNum>
-  <w:abstractNum w:abstractNumId="4" w15:restartNumberingAfterBreak="0">
+  <w:abstractNum w:abstractNumId="6" w15:restartNumberingAfterBreak="0">
     <w:nsid w:val="1D8666A0"/>
     <w:multiLevelType w:val="multilevel"/>
     <w:tmpl w:val="CD166D3C"/>
@@ -1805,7 +2917,7 @@
       </w:rPr>
     </w:lvl>
   </w:abstractNum>
-  <w:abstractNum w:abstractNumId="5" w15:restartNumberingAfterBreak="0">
+  <w:abstractNum w:abstractNumId="7" w15:restartNumberingAfterBreak="0">
     <w:nsid w:val="203829FE"/>
     <w:multiLevelType w:val="multilevel"/>
     <w:tmpl w:val="5B96224E"/>
@@ -1954,7 +3066,93 @@
       </w:rPr>
     </w:lvl>
   </w:abstractNum>
-  <w:abstractNum w:abstractNumId="6" w15:restartNumberingAfterBreak="0">
+  <w:abstractNum w:abstractNumId="8" w15:restartNumberingAfterBreak="0">
+    <w:nsid w:val="223741DA"/>
+    <w:multiLevelType w:val="hybridMultilevel"/>
+    <w:tmpl w:val="F2180BBA"/>
+    <w:lvl w:ilvl="0" w:tplc="0416000F">
+      <w:start w:val="1"/>
+      <w:numFmt w:val="decimal"/>
+      <w:lvlText w:val="%1."/>
+      <w:lvlJc w:val="left"/>
+      <w:pPr>
+        <w:ind w:left="1080" w:hanging="360"/>
+      </w:pPr>
+    </w:lvl>
+    <w:lvl w:ilvl="1" w:tplc="04160019" w:tentative="1">
+      <w:start w:val="1"/>
+      <w:numFmt w:val="lowerLetter"/>
+      <w:lvlText w:val="%2."/>
+      <w:lvlJc w:val="left"/>
+      <w:pPr>
+        <w:ind w:left="1800" w:hanging="360"/>
+      </w:pPr>
+    </w:lvl>
+    <w:lvl w:ilvl="2" w:tplc="0416001B" w:tentative="1">
+      <w:start w:val="1"/>
+      <w:numFmt w:val="lowerRoman"/>
+      <w:lvlText w:val="%3."/>
+      <w:lvlJc w:val="right"/>
+      <w:pPr>
+        <w:ind w:left="2520" w:hanging="180"/>
+      </w:pPr>
+    </w:lvl>
+    <w:lvl w:ilvl="3" w:tplc="0416000F" w:tentative="1">
+      <w:start w:val="1"/>
+      <w:numFmt w:val="decimal"/>
+      <w:lvlText w:val="%4."/>
+      <w:lvlJc w:val="left"/>
+      <w:pPr>
+        <w:ind w:left="3240" w:hanging="360"/>
+      </w:pPr>
+    </w:lvl>
+    <w:lvl w:ilvl="4" w:tplc="04160019" w:tentative="1">
+      <w:start w:val="1"/>
+      <w:numFmt w:val="lowerLetter"/>
+      <w:lvlText w:val="%5."/>
+      <w:lvlJc w:val="left"/>
+      <w:pPr>
+        <w:ind w:left="3960" w:hanging="360"/>
+      </w:pPr>
+    </w:lvl>
+    <w:lvl w:ilvl="5" w:tplc="0416001B" w:tentative="1">
+      <w:start w:val="1"/>
+      <w:numFmt w:val="lowerRoman"/>
+      <w:lvlText w:val="%6."/>
+      <w:lvlJc w:val="right"/>
+      <w:pPr>
+        <w:ind w:left="4680" w:hanging="180"/>
+      </w:pPr>
+    </w:lvl>
+    <w:lvl w:ilvl="6" w:tplc="0416000F" w:tentative="1">
+      <w:start w:val="1"/>
+      <w:numFmt w:val="decimal"/>
+      <w:lvlText w:val="%7."/>
+      <w:lvlJc w:val="left"/>
+      <w:pPr>
+        <w:ind w:left="5400" w:hanging="360"/>
+      </w:pPr>
+    </w:lvl>
+    <w:lvl w:ilvl="7" w:tplc="04160019" w:tentative="1">
+      <w:start w:val="1"/>
+      <w:numFmt w:val="lowerLetter"/>
+      <w:lvlText w:val="%8."/>
+      <w:lvlJc w:val="left"/>
+      <w:pPr>
+        <w:ind w:left="6120" w:hanging="360"/>
+      </w:pPr>
+    </w:lvl>
+    <w:lvl w:ilvl="8" w:tplc="0416001B" w:tentative="1">
+      <w:start w:val="1"/>
+      <w:numFmt w:val="lowerRoman"/>
+      <w:lvlText w:val="%9."/>
+      <w:lvlJc w:val="right"/>
+      <w:pPr>
+        <w:ind w:left="6840" w:hanging="180"/>
+      </w:pPr>
+    </w:lvl>
+  </w:abstractNum>
+  <w:abstractNum w:abstractNumId="9" w15:restartNumberingAfterBreak="0">
     <w:nsid w:val="24771AE5"/>
     <w:multiLevelType w:val="multilevel"/>
     <w:tmpl w:val="E68AEF44"/>
@@ -2075,7 +3273,7 @@
       </w:pPr>
     </w:lvl>
   </w:abstractNum>
-  <w:abstractNum w:abstractNumId="7" w15:restartNumberingAfterBreak="0">
+  <w:abstractNum w:abstractNumId="10" w15:restartNumberingAfterBreak="0">
     <w:nsid w:val="28602B51"/>
     <w:multiLevelType w:val="multilevel"/>
     <w:tmpl w:val="04BA916C"/>
@@ -2224,7 +3422,242 @@
       </w:rPr>
     </w:lvl>
   </w:abstractNum>
-  <w:abstractNum w:abstractNumId="8" w15:restartNumberingAfterBreak="0">
+  <w:abstractNum w:abstractNumId="11" w15:restartNumberingAfterBreak="0">
+    <w:nsid w:val="28ED5955"/>
+    <w:multiLevelType w:val="multilevel"/>
+    <w:tmpl w:val="ABFA1AD8"/>
+    <w:lvl w:ilvl="0">
+      <w:start w:val="1"/>
+      <w:numFmt w:val="bullet"/>
+      <w:lvlText w:val=""/>
+      <w:lvlJc w:val="left"/>
+      <w:pPr>
+        <w:tabs>
+          <w:tab w:val="num" w:pos="720"/>
+        </w:tabs>
+        <w:ind w:left="720" w:hanging="360"/>
+      </w:pPr>
+      <w:rPr>
+        <w:rFonts w:ascii="Symbol" w:hAnsi="Symbol" w:hint="default"/>
+        <w:sz w:val="20"/>
+      </w:rPr>
+    </w:lvl>
+    <w:lvl w:ilvl="1">
+      <w:start w:val="1"/>
+      <w:numFmt w:val="bullet"/>
+      <w:lvlText w:val=""/>
+      <w:lvlJc w:val="left"/>
+      <w:pPr>
+        <w:tabs>
+          <w:tab w:val="num" w:pos="1440"/>
+        </w:tabs>
+        <w:ind w:left="1440" w:hanging="360"/>
+      </w:pPr>
+      <w:rPr>
+        <w:rFonts w:ascii="Symbol" w:hAnsi="Symbol" w:hint="default"/>
+        <w:sz w:val="20"/>
+      </w:rPr>
+    </w:lvl>
+    <w:lvl w:ilvl="2" w:tentative="1">
+      <w:start w:val="1"/>
+      <w:numFmt w:val="bullet"/>
+      <w:lvlText w:val=""/>
+      <w:lvlJc w:val="left"/>
+      <w:pPr>
+        <w:tabs>
+          <w:tab w:val="num" w:pos="2160"/>
+        </w:tabs>
+        <w:ind w:left="2160" w:hanging="360"/>
+      </w:pPr>
+      <w:rPr>
+        <w:rFonts w:ascii="Symbol" w:hAnsi="Symbol" w:hint="default"/>
+        <w:sz w:val="20"/>
+      </w:rPr>
+    </w:lvl>
+    <w:lvl w:ilvl="3" w:tentative="1">
+      <w:start w:val="1"/>
+      <w:numFmt w:val="bullet"/>
+      <w:lvlText w:val=""/>
+      <w:lvlJc w:val="left"/>
+      <w:pPr>
+        <w:tabs>
+          <w:tab w:val="num" w:pos="2880"/>
+        </w:tabs>
+        <w:ind w:left="2880" w:hanging="360"/>
+      </w:pPr>
+      <w:rPr>
+        <w:rFonts w:ascii="Symbol" w:hAnsi="Symbol" w:hint="default"/>
+        <w:sz w:val="20"/>
+      </w:rPr>
+    </w:lvl>
+    <w:lvl w:ilvl="4" w:tentative="1">
+      <w:start w:val="1"/>
+      <w:numFmt w:val="bullet"/>
+      <w:lvlText w:val=""/>
+      <w:lvlJc w:val="left"/>
+      <w:pPr>
+        <w:tabs>
+          <w:tab w:val="num" w:pos="3600"/>
+        </w:tabs>
+        <w:ind w:left="3600" w:hanging="360"/>
+      </w:pPr>
+      <w:rPr>
+        <w:rFonts w:ascii="Symbol" w:hAnsi="Symbol" w:hint="default"/>
+        <w:sz w:val="20"/>
+      </w:rPr>
+    </w:lvl>
+    <w:lvl w:ilvl="5" w:tentative="1">
+      <w:start w:val="1"/>
+      <w:numFmt w:val="bullet"/>
+      <w:lvlText w:val=""/>
+      <w:lvlJc w:val="left"/>
+      <w:pPr>
+        <w:tabs>
+          <w:tab w:val="num" w:pos="4320"/>
+        </w:tabs>
+        <w:ind w:left="4320" w:hanging="360"/>
+      </w:pPr>
+      <w:rPr>
+        <w:rFonts w:ascii="Symbol" w:hAnsi="Symbol" w:hint="default"/>
+        <w:sz w:val="20"/>
+      </w:rPr>
+    </w:lvl>
+    <w:lvl w:ilvl="6" w:tentative="1">
+      <w:start w:val="1"/>
+      <w:numFmt w:val="bullet"/>
+      <w:lvlText w:val=""/>
+      <w:lvlJc w:val="left"/>
+      <w:pPr>
+        <w:tabs>
+          <w:tab w:val="num" w:pos="5040"/>
+        </w:tabs>
+        <w:ind w:left="5040" w:hanging="360"/>
+      </w:pPr>
+      <w:rPr>
+        <w:rFonts w:ascii="Symbol" w:hAnsi="Symbol" w:hint="default"/>
+        <w:sz w:val="20"/>
+      </w:rPr>
+    </w:lvl>
+    <w:lvl w:ilvl="7" w:tentative="1">
+      <w:start w:val="1"/>
+      <w:numFmt w:val="bullet"/>
+      <w:lvlText w:val=""/>
+      <w:lvlJc w:val="left"/>
+      <w:pPr>
+        <w:tabs>
+          <w:tab w:val="num" w:pos="5760"/>
+        </w:tabs>
+        <w:ind w:left="5760" w:hanging="360"/>
+      </w:pPr>
+      <w:rPr>
+        <w:rFonts w:ascii="Symbol" w:hAnsi="Symbol" w:hint="default"/>
+        <w:sz w:val="20"/>
+      </w:rPr>
+    </w:lvl>
+    <w:lvl w:ilvl="8" w:tentative="1">
+      <w:start w:val="1"/>
+      <w:numFmt w:val="bullet"/>
+      <w:lvlText w:val=""/>
+      <w:lvlJc w:val="left"/>
+      <w:pPr>
+        <w:tabs>
+          <w:tab w:val="num" w:pos="6480"/>
+        </w:tabs>
+        <w:ind w:left="6480" w:hanging="360"/>
+      </w:pPr>
+      <w:rPr>
+        <w:rFonts w:ascii="Symbol" w:hAnsi="Symbol" w:hint="default"/>
+        <w:sz w:val="20"/>
+      </w:rPr>
+    </w:lvl>
+  </w:abstractNum>
+  <w:abstractNum w:abstractNumId="12" w15:restartNumberingAfterBreak="0">
+    <w:nsid w:val="2E941E3C"/>
+    <w:multiLevelType w:val="hybridMultilevel"/>
+    <w:tmpl w:val="4A5C17D4"/>
+    <w:lvl w:ilvl="0" w:tplc="0416000F">
+      <w:start w:val="1"/>
+      <w:numFmt w:val="decimal"/>
+      <w:lvlText w:val="%1."/>
+      <w:lvlJc w:val="left"/>
+      <w:pPr>
+        <w:ind w:left="720" w:hanging="360"/>
+      </w:pPr>
+    </w:lvl>
+    <w:lvl w:ilvl="1" w:tplc="04160019" w:tentative="1">
+      <w:start w:val="1"/>
+      <w:numFmt w:val="lowerLetter"/>
+      <w:lvlText w:val="%2."/>
+      <w:lvlJc w:val="left"/>
+      <w:pPr>
+        <w:ind w:left="1440" w:hanging="360"/>
+      </w:pPr>
+    </w:lvl>
+    <w:lvl w:ilvl="2" w:tplc="0416001B" w:tentative="1">
+      <w:start w:val="1"/>
+      <w:numFmt w:val="lowerRoman"/>
+      <w:lvlText w:val="%3."/>
+      <w:lvlJc w:val="right"/>
+      <w:pPr>
+        <w:ind w:left="2160" w:hanging="180"/>
+      </w:pPr>
+    </w:lvl>
+    <w:lvl w:ilvl="3" w:tplc="0416000F" w:tentative="1">
+      <w:start w:val="1"/>
+      <w:numFmt w:val="decimal"/>
+      <w:lvlText w:val="%4."/>
+      <w:lvlJc w:val="left"/>
+      <w:pPr>
+        <w:ind w:left="2880" w:hanging="360"/>
+      </w:pPr>
+    </w:lvl>
+    <w:lvl w:ilvl="4" w:tplc="04160019" w:tentative="1">
+      <w:start w:val="1"/>
+      <w:numFmt w:val="lowerLetter"/>
+      <w:lvlText w:val="%5."/>
+      <w:lvlJc w:val="left"/>
+      <w:pPr>
+        <w:ind w:left="3600" w:hanging="360"/>
+      </w:pPr>
+    </w:lvl>
+    <w:lvl w:ilvl="5" w:tplc="0416001B" w:tentative="1">
+      <w:start w:val="1"/>
+      <w:numFmt w:val="lowerRoman"/>
+      <w:lvlText w:val="%6."/>
+      <w:lvlJc w:val="right"/>
+      <w:pPr>
+        <w:ind w:left="4320" w:hanging="180"/>
+      </w:pPr>
+    </w:lvl>
+    <w:lvl w:ilvl="6" w:tplc="0416000F" w:tentative="1">
+      <w:start w:val="1"/>
+      <w:numFmt w:val="decimal"/>
+      <w:lvlText w:val="%7."/>
+      <w:lvlJc w:val="left"/>
+      <w:pPr>
+        <w:ind w:left="5040" w:hanging="360"/>
+      </w:pPr>
+    </w:lvl>
+    <w:lvl w:ilvl="7" w:tplc="04160019" w:tentative="1">
+      <w:start w:val="1"/>
+      <w:numFmt w:val="lowerLetter"/>
+      <w:lvlText w:val="%8."/>
+      <w:lvlJc w:val="left"/>
+      <w:pPr>
+        <w:ind w:left="5760" w:hanging="360"/>
+      </w:pPr>
+    </w:lvl>
+    <w:lvl w:ilvl="8" w:tplc="0416001B" w:tentative="1">
+      <w:start w:val="1"/>
+      <w:numFmt w:val="lowerRoman"/>
+      <w:lvlText w:val="%9."/>
+      <w:lvlJc w:val="right"/>
+      <w:pPr>
+        <w:ind w:left="6480" w:hanging="180"/>
+      </w:pPr>
+    </w:lvl>
+  </w:abstractNum>
+  <w:abstractNum w:abstractNumId="13" w15:restartNumberingAfterBreak="0">
     <w:nsid w:val="32BE5421"/>
     <w:multiLevelType w:val="multilevel"/>
     <w:tmpl w:val="7FD480A4"/>
@@ -2373,7 +3806,7 @@
       </w:rPr>
     </w:lvl>
   </w:abstractNum>
-  <w:abstractNum w:abstractNumId="9" w15:restartNumberingAfterBreak="0">
+  <w:abstractNum w:abstractNumId="14" w15:restartNumberingAfterBreak="0">
     <w:nsid w:val="353E5767"/>
     <w:multiLevelType w:val="multilevel"/>
     <w:tmpl w:val="B8D6A230"/>
@@ -2522,7 +3955,93 @@
       </w:rPr>
     </w:lvl>
   </w:abstractNum>
-  <w:abstractNum w:abstractNumId="10" w15:restartNumberingAfterBreak="0">
+  <w:abstractNum w:abstractNumId="15" w15:restartNumberingAfterBreak="0">
+    <w:nsid w:val="35CE6E5F"/>
+    <w:multiLevelType w:val="multilevel"/>
+    <w:tmpl w:val="0416001F"/>
+    <w:lvl w:ilvl="0">
+      <w:start w:val="1"/>
+      <w:numFmt w:val="decimal"/>
+      <w:lvlText w:val="%1."/>
+      <w:lvlJc w:val="left"/>
+      <w:pPr>
+        <w:ind w:left="360" w:hanging="360"/>
+      </w:pPr>
+    </w:lvl>
+    <w:lvl w:ilvl="1">
+      <w:start w:val="1"/>
+      <w:numFmt w:val="decimal"/>
+      <w:lvlText w:val="%1.%2."/>
+      <w:lvlJc w:val="left"/>
+      <w:pPr>
+        <w:ind w:left="792" w:hanging="432"/>
+      </w:pPr>
+    </w:lvl>
+    <w:lvl w:ilvl="2">
+      <w:start w:val="1"/>
+      <w:numFmt w:val="decimal"/>
+      <w:lvlText w:val="%1.%2.%3."/>
+      <w:lvlJc w:val="left"/>
+      <w:pPr>
+        <w:ind w:left="1224" w:hanging="504"/>
+      </w:pPr>
+    </w:lvl>
+    <w:lvl w:ilvl="3">
+      <w:start w:val="1"/>
+      <w:numFmt w:val="decimal"/>
+      <w:lvlText w:val="%1.%2.%3.%4."/>
+      <w:lvlJc w:val="left"/>
+      <w:pPr>
+        <w:ind w:left="1728" w:hanging="648"/>
+      </w:pPr>
+    </w:lvl>
+    <w:lvl w:ilvl="4">
+      <w:start w:val="1"/>
+      <w:numFmt w:val="decimal"/>
+      <w:lvlText w:val="%1.%2.%3.%4.%5."/>
+      <w:lvlJc w:val="left"/>
+      <w:pPr>
+        <w:ind w:left="2232" w:hanging="792"/>
+      </w:pPr>
+    </w:lvl>
+    <w:lvl w:ilvl="5">
+      <w:start w:val="1"/>
+      <w:numFmt w:val="decimal"/>
+      <w:lvlText w:val="%1.%2.%3.%4.%5.%6."/>
+      <w:lvlJc w:val="left"/>
+      <w:pPr>
+        <w:ind w:left="2736" w:hanging="936"/>
+      </w:pPr>
+    </w:lvl>
+    <w:lvl w:ilvl="6">
+      <w:start w:val="1"/>
+      <w:numFmt w:val="decimal"/>
+      <w:lvlText w:val="%1.%2.%3.%4.%5.%6.%7."/>
+      <w:lvlJc w:val="left"/>
+      <w:pPr>
+        <w:ind w:left="3240" w:hanging="1080"/>
+      </w:pPr>
+    </w:lvl>
+    <w:lvl w:ilvl="7">
+      <w:start w:val="1"/>
+      <w:numFmt w:val="decimal"/>
+      <w:lvlText w:val="%1.%2.%3.%4.%5.%6.%7.%8."/>
+      <w:lvlJc w:val="left"/>
+      <w:pPr>
+        <w:ind w:left="3744" w:hanging="1224"/>
+      </w:pPr>
+    </w:lvl>
+    <w:lvl w:ilvl="8">
+      <w:start w:val="1"/>
+      <w:numFmt w:val="decimal"/>
+      <w:lvlText w:val="%1.%2.%3.%4.%5.%6.%7.%8.%9."/>
+      <w:lvlJc w:val="left"/>
+      <w:pPr>
+        <w:ind w:left="4320" w:hanging="1440"/>
+      </w:pPr>
+    </w:lvl>
+  </w:abstractNum>
+  <w:abstractNum w:abstractNumId="16" w15:restartNumberingAfterBreak="0">
     <w:nsid w:val="3A92282B"/>
     <w:multiLevelType w:val="multilevel"/>
     <w:tmpl w:val="5D7A865A"/>
@@ -2671,7 +4190,269 @@
       </w:rPr>
     </w:lvl>
   </w:abstractNum>
-  <w:abstractNum w:abstractNumId="11" w15:restartNumberingAfterBreak="0">
+  <w:abstractNum w:abstractNumId="17" w15:restartNumberingAfterBreak="0">
+    <w:nsid w:val="3B555C57"/>
+    <w:multiLevelType w:val="multilevel"/>
+    <w:tmpl w:val="7FD480A4"/>
+    <w:lvl w:ilvl="0">
+      <w:start w:val="1"/>
+      <w:numFmt w:val="bullet"/>
+      <w:lvlText w:val=""/>
+      <w:lvlJc w:val="left"/>
+      <w:pPr>
+        <w:tabs>
+          <w:tab w:val="num" w:pos="720"/>
+        </w:tabs>
+        <w:ind w:left="720" w:hanging="360"/>
+      </w:pPr>
+      <w:rPr>
+        <w:rFonts w:ascii="Symbol" w:hAnsi="Symbol" w:hint="default"/>
+        <w:sz w:val="20"/>
+      </w:rPr>
+    </w:lvl>
+    <w:lvl w:ilvl="1">
+      <w:start w:val="1"/>
+      <w:numFmt w:val="bullet"/>
+      <w:lvlText w:val=""/>
+      <w:lvlJc w:val="left"/>
+      <w:pPr>
+        <w:tabs>
+          <w:tab w:val="num" w:pos="1440"/>
+        </w:tabs>
+        <w:ind w:left="1440" w:hanging="360"/>
+      </w:pPr>
+      <w:rPr>
+        <w:rFonts w:ascii="Symbol" w:hAnsi="Symbol" w:hint="default"/>
+        <w:sz w:val="20"/>
+      </w:rPr>
+    </w:lvl>
+    <w:lvl w:ilvl="2" w:tentative="1">
+      <w:start w:val="1"/>
+      <w:numFmt w:val="bullet"/>
+      <w:lvlText w:val=""/>
+      <w:lvlJc w:val="left"/>
+      <w:pPr>
+        <w:tabs>
+          <w:tab w:val="num" w:pos="2160"/>
+        </w:tabs>
+        <w:ind w:left="2160" w:hanging="360"/>
+      </w:pPr>
+      <w:rPr>
+        <w:rFonts w:ascii="Symbol" w:hAnsi="Symbol" w:hint="default"/>
+        <w:sz w:val="20"/>
+      </w:rPr>
+    </w:lvl>
+    <w:lvl w:ilvl="3" w:tentative="1">
+      <w:start w:val="1"/>
+      <w:numFmt w:val="bullet"/>
+      <w:lvlText w:val=""/>
+      <w:lvlJc w:val="left"/>
+      <w:pPr>
+        <w:tabs>
+          <w:tab w:val="num" w:pos="2880"/>
+        </w:tabs>
+        <w:ind w:left="2880" w:hanging="360"/>
+      </w:pPr>
+      <w:rPr>
+        <w:rFonts w:ascii="Symbol" w:hAnsi="Symbol" w:hint="default"/>
+        <w:sz w:val="20"/>
+      </w:rPr>
+    </w:lvl>
+    <w:lvl w:ilvl="4" w:tentative="1">
+      <w:start w:val="1"/>
+      <w:numFmt w:val="bullet"/>
+      <w:lvlText w:val=""/>
+      <w:lvlJc w:val="left"/>
+      <w:pPr>
+        <w:tabs>
+          <w:tab w:val="num" w:pos="3600"/>
+        </w:tabs>
+        <w:ind w:left="3600" w:hanging="360"/>
+      </w:pPr>
+      <w:rPr>
+        <w:rFonts w:ascii="Symbol" w:hAnsi="Symbol" w:hint="default"/>
+        <w:sz w:val="20"/>
+      </w:rPr>
+    </w:lvl>
+    <w:lvl w:ilvl="5" w:tentative="1">
+      <w:start w:val="1"/>
+      <w:numFmt w:val="bullet"/>
+      <w:lvlText w:val=""/>
+      <w:lvlJc w:val="left"/>
+      <w:pPr>
+        <w:tabs>
+          <w:tab w:val="num" w:pos="4320"/>
+        </w:tabs>
+        <w:ind w:left="4320" w:hanging="360"/>
+      </w:pPr>
+      <w:rPr>
+        <w:rFonts w:ascii="Symbol" w:hAnsi="Symbol" w:hint="default"/>
+        <w:sz w:val="20"/>
+      </w:rPr>
+    </w:lvl>
+    <w:lvl w:ilvl="6" w:tentative="1">
+      <w:start w:val="1"/>
+      <w:numFmt w:val="bullet"/>
+      <w:lvlText w:val=""/>
+      <w:lvlJc w:val="left"/>
+      <w:pPr>
+        <w:tabs>
+          <w:tab w:val="num" w:pos="5040"/>
+        </w:tabs>
+        <w:ind w:left="5040" w:hanging="360"/>
+      </w:pPr>
+      <w:rPr>
+        <w:rFonts w:ascii="Symbol" w:hAnsi="Symbol" w:hint="default"/>
+        <w:sz w:val="20"/>
+      </w:rPr>
+    </w:lvl>
+    <w:lvl w:ilvl="7" w:tentative="1">
+      <w:start w:val="1"/>
+      <w:numFmt w:val="bullet"/>
+      <w:lvlText w:val=""/>
+      <w:lvlJc w:val="left"/>
+      <w:pPr>
+        <w:tabs>
+          <w:tab w:val="num" w:pos="5760"/>
+        </w:tabs>
+        <w:ind w:left="5760" w:hanging="360"/>
+      </w:pPr>
+      <w:rPr>
+        <w:rFonts w:ascii="Symbol" w:hAnsi="Symbol" w:hint="default"/>
+        <w:sz w:val="20"/>
+      </w:rPr>
+    </w:lvl>
+    <w:lvl w:ilvl="8" w:tentative="1">
+      <w:start w:val="1"/>
+      <w:numFmt w:val="bullet"/>
+      <w:lvlText w:val=""/>
+      <w:lvlJc w:val="left"/>
+      <w:pPr>
+        <w:tabs>
+          <w:tab w:val="num" w:pos="6480"/>
+        </w:tabs>
+        <w:ind w:left="6480" w:hanging="360"/>
+      </w:pPr>
+      <w:rPr>
+        <w:rFonts w:ascii="Symbol" w:hAnsi="Symbol" w:hint="default"/>
+        <w:sz w:val="20"/>
+      </w:rPr>
+    </w:lvl>
+  </w:abstractNum>
+  <w:abstractNum w:abstractNumId="18" w15:restartNumberingAfterBreak="0">
+    <w:nsid w:val="3D9E04EC"/>
+    <w:multiLevelType w:val="hybridMultilevel"/>
+    <w:tmpl w:val="14344B4C"/>
+    <w:lvl w:ilvl="0" w:tplc="04160001">
+      <w:start w:val="1"/>
+      <w:numFmt w:val="bullet"/>
+      <w:lvlText w:val=""/>
+      <w:lvlJc w:val="left"/>
+      <w:pPr>
+        <w:ind w:left="720" w:hanging="360"/>
+      </w:pPr>
+      <w:rPr>
+        <w:rFonts w:ascii="Symbol" w:hAnsi="Symbol" w:hint="default"/>
+      </w:rPr>
+    </w:lvl>
+    <w:lvl w:ilvl="1" w:tplc="04160003" w:tentative="1">
+      <w:start w:val="1"/>
+      <w:numFmt w:val="bullet"/>
+      <w:lvlText w:val="o"/>
+      <w:lvlJc w:val="left"/>
+      <w:pPr>
+        <w:ind w:left="1440" w:hanging="360"/>
+      </w:pPr>
+      <w:rPr>
+        <w:rFonts w:ascii="Courier New" w:hAnsi="Courier New" w:cs="Courier New" w:hint="default"/>
+      </w:rPr>
+    </w:lvl>
+    <w:lvl w:ilvl="2" w:tplc="04160005" w:tentative="1">
+      <w:start w:val="1"/>
+      <w:numFmt w:val="bullet"/>
+      <w:lvlText w:val=""/>
+      <w:lvlJc w:val="left"/>
+      <w:pPr>
+        <w:ind w:left="2160" w:hanging="360"/>
+      </w:pPr>
+      <w:rPr>
+        <w:rFonts w:ascii="Wingdings" w:hAnsi="Wingdings" w:hint="default"/>
+      </w:rPr>
+    </w:lvl>
+    <w:lvl w:ilvl="3" w:tplc="04160001" w:tentative="1">
+      <w:start w:val="1"/>
+      <w:numFmt w:val="bullet"/>
+      <w:lvlText w:val=""/>
+      <w:lvlJc w:val="left"/>
+      <w:pPr>
+        <w:ind w:left="2880" w:hanging="360"/>
+      </w:pPr>
+      <w:rPr>
+        <w:rFonts w:ascii="Symbol" w:hAnsi="Symbol" w:hint="default"/>
+      </w:rPr>
+    </w:lvl>
+    <w:lvl w:ilvl="4" w:tplc="04160003" w:tentative="1">
+      <w:start w:val="1"/>
+      <w:numFmt w:val="bullet"/>
+      <w:lvlText w:val="o"/>
+      <w:lvlJc w:val="left"/>
+      <w:pPr>
+        <w:ind w:left="3600" w:hanging="360"/>
+      </w:pPr>
+      <w:rPr>
+        <w:rFonts w:ascii="Courier New" w:hAnsi="Courier New" w:cs="Courier New" w:hint="default"/>
+      </w:rPr>
+    </w:lvl>
+    <w:lvl w:ilvl="5" w:tplc="04160005" w:tentative="1">
+      <w:start w:val="1"/>
+      <w:numFmt w:val="bullet"/>
+      <w:lvlText w:val=""/>
+      <w:lvlJc w:val="left"/>
+      <w:pPr>
+        <w:ind w:left="4320" w:hanging="360"/>
+      </w:pPr>
+      <w:rPr>
+        <w:rFonts w:ascii="Wingdings" w:hAnsi="Wingdings" w:hint="default"/>
+      </w:rPr>
+    </w:lvl>
+    <w:lvl w:ilvl="6" w:tplc="04160001" w:tentative="1">
+      <w:start w:val="1"/>
+      <w:numFmt w:val="bullet"/>
+      <w:lvlText w:val=""/>
+      <w:lvlJc w:val="left"/>
+      <w:pPr>
+        <w:ind w:left="5040" w:hanging="360"/>
+      </w:pPr>
+      <w:rPr>
+        <w:rFonts w:ascii="Symbol" w:hAnsi="Symbol" w:hint="default"/>
+      </w:rPr>
+    </w:lvl>
+    <w:lvl w:ilvl="7" w:tplc="04160003" w:tentative="1">
+      <w:start w:val="1"/>
+      <w:numFmt w:val="bullet"/>
+      <w:lvlText w:val="o"/>
+      <w:lvlJc w:val="left"/>
+      <w:pPr>
+        <w:ind w:left="5760" w:hanging="360"/>
+      </w:pPr>
+      <w:rPr>
+        <w:rFonts w:ascii="Courier New" w:hAnsi="Courier New" w:cs="Courier New" w:hint="default"/>
+      </w:rPr>
+    </w:lvl>
+    <w:lvl w:ilvl="8" w:tplc="04160005" w:tentative="1">
+      <w:start w:val="1"/>
+      <w:numFmt w:val="bullet"/>
+      <w:lvlText w:val=""/>
+      <w:lvlJc w:val="left"/>
+      <w:pPr>
+        <w:ind w:left="6480" w:hanging="360"/>
+      </w:pPr>
+      <w:rPr>
+        <w:rFonts w:ascii="Wingdings" w:hAnsi="Wingdings" w:hint="default"/>
+      </w:rPr>
+    </w:lvl>
+  </w:abstractNum>
+  <w:abstractNum w:abstractNumId="19" w15:restartNumberingAfterBreak="0">
     <w:nsid w:val="3FE03381"/>
     <w:multiLevelType w:val="multilevel"/>
     <w:tmpl w:val="4A40FB5E"/>
@@ -2820,7 +4601,7 @@
       </w:rPr>
     </w:lvl>
   </w:abstractNum>
-  <w:abstractNum w:abstractNumId="12" w15:restartNumberingAfterBreak="0">
+  <w:abstractNum w:abstractNumId="20" w15:restartNumberingAfterBreak="0">
     <w:nsid w:val="42421521"/>
     <w:multiLevelType w:val="multilevel"/>
     <w:tmpl w:val="765C440A"/>
@@ -2969,7 +4750,93 @@
       </w:rPr>
     </w:lvl>
   </w:abstractNum>
-  <w:abstractNum w:abstractNumId="13" w15:restartNumberingAfterBreak="0">
+  <w:abstractNum w:abstractNumId="21" w15:restartNumberingAfterBreak="0">
+    <w:nsid w:val="44717454"/>
+    <w:multiLevelType w:val="hybridMultilevel"/>
+    <w:tmpl w:val="D2B0575A"/>
+    <w:lvl w:ilvl="0" w:tplc="0416000F">
+      <w:start w:val="1"/>
+      <w:numFmt w:val="decimal"/>
+      <w:lvlText w:val="%1."/>
+      <w:lvlJc w:val="left"/>
+      <w:pPr>
+        <w:ind w:left="720" w:hanging="360"/>
+      </w:pPr>
+    </w:lvl>
+    <w:lvl w:ilvl="1" w:tplc="04160019" w:tentative="1">
+      <w:start w:val="1"/>
+      <w:numFmt w:val="lowerLetter"/>
+      <w:lvlText w:val="%2."/>
+      <w:lvlJc w:val="left"/>
+      <w:pPr>
+        <w:ind w:left="1440" w:hanging="360"/>
+      </w:pPr>
+    </w:lvl>
+    <w:lvl w:ilvl="2" w:tplc="0416001B" w:tentative="1">
+      <w:start w:val="1"/>
+      <w:numFmt w:val="lowerRoman"/>
+      <w:lvlText w:val="%3."/>
+      <w:lvlJc w:val="right"/>
+      <w:pPr>
+        <w:ind w:left="2160" w:hanging="180"/>
+      </w:pPr>
+    </w:lvl>
+    <w:lvl w:ilvl="3" w:tplc="0416000F" w:tentative="1">
+      <w:start w:val="1"/>
+      <w:numFmt w:val="decimal"/>
+      <w:lvlText w:val="%4."/>
+      <w:lvlJc w:val="left"/>
+      <w:pPr>
+        <w:ind w:left="2880" w:hanging="360"/>
+      </w:pPr>
+    </w:lvl>
+    <w:lvl w:ilvl="4" w:tplc="04160019" w:tentative="1">
+      <w:start w:val="1"/>
+      <w:numFmt w:val="lowerLetter"/>
+      <w:lvlText w:val="%5."/>
+      <w:lvlJc w:val="left"/>
+      <w:pPr>
+        <w:ind w:left="3600" w:hanging="360"/>
+      </w:pPr>
+    </w:lvl>
+    <w:lvl w:ilvl="5" w:tplc="0416001B" w:tentative="1">
+      <w:start w:val="1"/>
+      <w:numFmt w:val="lowerRoman"/>
+      <w:lvlText w:val="%6."/>
+      <w:lvlJc w:val="right"/>
+      <w:pPr>
+        <w:ind w:left="4320" w:hanging="180"/>
+      </w:pPr>
+    </w:lvl>
+    <w:lvl w:ilvl="6" w:tplc="0416000F" w:tentative="1">
+      <w:start w:val="1"/>
+      <w:numFmt w:val="decimal"/>
+      <w:lvlText w:val="%7."/>
+      <w:lvlJc w:val="left"/>
+      <w:pPr>
+        <w:ind w:left="5040" w:hanging="360"/>
+      </w:pPr>
+    </w:lvl>
+    <w:lvl w:ilvl="7" w:tplc="04160019" w:tentative="1">
+      <w:start w:val="1"/>
+      <w:numFmt w:val="lowerLetter"/>
+      <w:lvlText w:val="%8."/>
+      <w:lvlJc w:val="left"/>
+      <w:pPr>
+        <w:ind w:left="5760" w:hanging="360"/>
+      </w:pPr>
+    </w:lvl>
+    <w:lvl w:ilvl="8" w:tplc="0416001B" w:tentative="1">
+      <w:start w:val="1"/>
+      <w:numFmt w:val="lowerRoman"/>
+      <w:lvlText w:val="%9."/>
+      <w:lvlJc w:val="right"/>
+      <w:pPr>
+        <w:ind w:left="6480" w:hanging="180"/>
+      </w:pPr>
+    </w:lvl>
+  </w:abstractNum>
+  <w:abstractNum w:abstractNumId="22" w15:restartNumberingAfterBreak="0">
     <w:nsid w:val="458E1652"/>
     <w:multiLevelType w:val="multilevel"/>
     <w:tmpl w:val="072A34D0"/>
@@ -3118,7 +4985,301 @@
       </w:rPr>
     </w:lvl>
   </w:abstractNum>
-  <w:abstractNum w:abstractNumId="14" w15:restartNumberingAfterBreak="0">
+  <w:abstractNum w:abstractNumId="23" w15:restartNumberingAfterBreak="0">
+    <w:nsid w:val="4E5D7BE9"/>
+    <w:multiLevelType w:val="multilevel"/>
+    <w:tmpl w:val="7FD480A4"/>
+    <w:lvl w:ilvl="0">
+      <w:start w:val="1"/>
+      <w:numFmt w:val="bullet"/>
+      <w:lvlText w:val=""/>
+      <w:lvlJc w:val="left"/>
+      <w:pPr>
+        <w:tabs>
+          <w:tab w:val="num" w:pos="720"/>
+        </w:tabs>
+        <w:ind w:left="720" w:hanging="360"/>
+      </w:pPr>
+      <w:rPr>
+        <w:rFonts w:ascii="Symbol" w:hAnsi="Symbol" w:hint="default"/>
+        <w:sz w:val="20"/>
+      </w:rPr>
+    </w:lvl>
+    <w:lvl w:ilvl="1">
+      <w:start w:val="1"/>
+      <w:numFmt w:val="bullet"/>
+      <w:lvlText w:val=""/>
+      <w:lvlJc w:val="left"/>
+      <w:pPr>
+        <w:tabs>
+          <w:tab w:val="num" w:pos="1440"/>
+        </w:tabs>
+        <w:ind w:left="1440" w:hanging="360"/>
+      </w:pPr>
+      <w:rPr>
+        <w:rFonts w:ascii="Symbol" w:hAnsi="Symbol" w:hint="default"/>
+        <w:sz w:val="20"/>
+      </w:rPr>
+    </w:lvl>
+    <w:lvl w:ilvl="2" w:tentative="1">
+      <w:start w:val="1"/>
+      <w:numFmt w:val="bullet"/>
+      <w:lvlText w:val=""/>
+      <w:lvlJc w:val="left"/>
+      <w:pPr>
+        <w:tabs>
+          <w:tab w:val="num" w:pos="2160"/>
+        </w:tabs>
+        <w:ind w:left="2160" w:hanging="360"/>
+      </w:pPr>
+      <w:rPr>
+        <w:rFonts w:ascii="Symbol" w:hAnsi="Symbol" w:hint="default"/>
+        <w:sz w:val="20"/>
+      </w:rPr>
+    </w:lvl>
+    <w:lvl w:ilvl="3" w:tentative="1">
+      <w:start w:val="1"/>
+      <w:numFmt w:val="bullet"/>
+      <w:lvlText w:val=""/>
+      <w:lvlJc w:val="left"/>
+      <w:pPr>
+        <w:tabs>
+          <w:tab w:val="num" w:pos="2880"/>
+        </w:tabs>
+        <w:ind w:left="2880" w:hanging="360"/>
+      </w:pPr>
+      <w:rPr>
+        <w:rFonts w:ascii="Symbol" w:hAnsi="Symbol" w:hint="default"/>
+        <w:sz w:val="20"/>
+      </w:rPr>
+    </w:lvl>
+    <w:lvl w:ilvl="4" w:tentative="1">
+      <w:start w:val="1"/>
+      <w:numFmt w:val="bullet"/>
+      <w:lvlText w:val=""/>
+      <w:lvlJc w:val="left"/>
+      <w:pPr>
+        <w:tabs>
+          <w:tab w:val="num" w:pos="3600"/>
+        </w:tabs>
+        <w:ind w:left="3600" w:hanging="360"/>
+      </w:pPr>
+      <w:rPr>
+        <w:rFonts w:ascii="Symbol" w:hAnsi="Symbol" w:hint="default"/>
+        <w:sz w:val="20"/>
+      </w:rPr>
+    </w:lvl>
+    <w:lvl w:ilvl="5" w:tentative="1">
+      <w:start w:val="1"/>
+      <w:numFmt w:val="bullet"/>
+      <w:lvlText w:val=""/>
+      <w:lvlJc w:val="left"/>
+      <w:pPr>
+        <w:tabs>
+          <w:tab w:val="num" w:pos="4320"/>
+        </w:tabs>
+        <w:ind w:left="4320" w:hanging="360"/>
+      </w:pPr>
+      <w:rPr>
+        <w:rFonts w:ascii="Symbol" w:hAnsi="Symbol" w:hint="default"/>
+        <w:sz w:val="20"/>
+      </w:rPr>
+    </w:lvl>
+    <w:lvl w:ilvl="6" w:tentative="1">
+      <w:start w:val="1"/>
+      <w:numFmt w:val="bullet"/>
+      <w:lvlText w:val=""/>
+      <w:lvlJc w:val="left"/>
+      <w:pPr>
+        <w:tabs>
+          <w:tab w:val="num" w:pos="5040"/>
+        </w:tabs>
+        <w:ind w:left="5040" w:hanging="360"/>
+      </w:pPr>
+      <w:rPr>
+        <w:rFonts w:ascii="Symbol" w:hAnsi="Symbol" w:hint="default"/>
+        <w:sz w:val="20"/>
+      </w:rPr>
+    </w:lvl>
+    <w:lvl w:ilvl="7" w:tentative="1">
+      <w:start w:val="1"/>
+      <w:numFmt w:val="bullet"/>
+      <w:lvlText w:val=""/>
+      <w:lvlJc w:val="left"/>
+      <w:pPr>
+        <w:tabs>
+          <w:tab w:val="num" w:pos="5760"/>
+        </w:tabs>
+        <w:ind w:left="5760" w:hanging="360"/>
+      </w:pPr>
+      <w:rPr>
+        <w:rFonts w:ascii="Symbol" w:hAnsi="Symbol" w:hint="default"/>
+        <w:sz w:val="20"/>
+      </w:rPr>
+    </w:lvl>
+    <w:lvl w:ilvl="8" w:tentative="1">
+      <w:start w:val="1"/>
+      <w:numFmt w:val="bullet"/>
+      <w:lvlText w:val=""/>
+      <w:lvlJc w:val="left"/>
+      <w:pPr>
+        <w:tabs>
+          <w:tab w:val="num" w:pos="6480"/>
+        </w:tabs>
+        <w:ind w:left="6480" w:hanging="360"/>
+      </w:pPr>
+      <w:rPr>
+        <w:rFonts w:ascii="Symbol" w:hAnsi="Symbol" w:hint="default"/>
+        <w:sz w:val="20"/>
+      </w:rPr>
+    </w:lvl>
+  </w:abstractNum>
+  <w:abstractNum w:abstractNumId="24" w15:restartNumberingAfterBreak="0">
+    <w:nsid w:val="50576766"/>
+    <w:multiLevelType w:val="multilevel"/>
+    <w:tmpl w:val="DBF4CE76"/>
+    <w:lvl w:ilvl="0">
+      <w:start w:val="1"/>
+      <w:numFmt w:val="bullet"/>
+      <w:lvlText w:val=""/>
+      <w:lvlJc w:val="left"/>
+      <w:pPr>
+        <w:tabs>
+          <w:tab w:val="num" w:pos="720"/>
+        </w:tabs>
+        <w:ind w:left="720" w:hanging="360"/>
+      </w:pPr>
+      <w:rPr>
+        <w:rFonts w:ascii="Symbol" w:hAnsi="Symbol" w:hint="default"/>
+        <w:sz w:val="20"/>
+      </w:rPr>
+    </w:lvl>
+    <w:lvl w:ilvl="1">
+      <w:start w:val="1"/>
+      <w:numFmt w:val="bullet"/>
+      <w:lvlText w:val=""/>
+      <w:lvlJc w:val="left"/>
+      <w:pPr>
+        <w:tabs>
+          <w:tab w:val="num" w:pos="1440"/>
+        </w:tabs>
+        <w:ind w:left="1440" w:hanging="360"/>
+      </w:pPr>
+      <w:rPr>
+        <w:rFonts w:ascii="Symbol" w:hAnsi="Symbol" w:hint="default"/>
+        <w:sz w:val="20"/>
+      </w:rPr>
+    </w:lvl>
+    <w:lvl w:ilvl="2">
+      <w:start w:val="1"/>
+      <w:numFmt w:val="decimal"/>
+      <w:lvlText w:val="%3."/>
+      <w:lvlJc w:val="left"/>
+      <w:pPr>
+        <w:ind w:left="2160" w:hanging="360"/>
+      </w:pPr>
+      <w:rPr>
+        <w:rFonts w:hint="default"/>
+      </w:rPr>
+    </w:lvl>
+    <w:lvl w:ilvl="3" w:tentative="1">
+      <w:start w:val="1"/>
+      <w:numFmt w:val="bullet"/>
+      <w:lvlText w:val=""/>
+      <w:lvlJc w:val="left"/>
+      <w:pPr>
+        <w:tabs>
+          <w:tab w:val="num" w:pos="2880"/>
+        </w:tabs>
+        <w:ind w:left="2880" w:hanging="360"/>
+      </w:pPr>
+      <w:rPr>
+        <w:rFonts w:ascii="Symbol" w:hAnsi="Symbol" w:hint="default"/>
+        <w:sz w:val="20"/>
+      </w:rPr>
+    </w:lvl>
+    <w:lvl w:ilvl="4" w:tentative="1">
+      <w:start w:val="1"/>
+      <w:numFmt w:val="bullet"/>
+      <w:lvlText w:val=""/>
+      <w:lvlJc w:val="left"/>
+      <w:pPr>
+        <w:tabs>
+          <w:tab w:val="num" w:pos="3600"/>
+        </w:tabs>
+        <w:ind w:left="3600" w:hanging="360"/>
+      </w:pPr>
+      <w:rPr>
+        <w:rFonts w:ascii="Symbol" w:hAnsi="Symbol" w:hint="default"/>
+        <w:sz w:val="20"/>
+      </w:rPr>
+    </w:lvl>
+    <w:lvl w:ilvl="5" w:tentative="1">
+      <w:start w:val="1"/>
+      <w:numFmt w:val="bullet"/>
+      <w:lvlText w:val=""/>
+      <w:lvlJc w:val="left"/>
+      <w:pPr>
+        <w:tabs>
+          <w:tab w:val="num" w:pos="4320"/>
+        </w:tabs>
+        <w:ind w:left="4320" w:hanging="360"/>
+      </w:pPr>
+      <w:rPr>
+        <w:rFonts w:ascii="Symbol" w:hAnsi="Symbol" w:hint="default"/>
+        <w:sz w:val="20"/>
+      </w:rPr>
+    </w:lvl>
+    <w:lvl w:ilvl="6" w:tentative="1">
+      <w:start w:val="1"/>
+      <w:numFmt w:val="bullet"/>
+      <w:lvlText w:val=""/>
+      <w:lvlJc w:val="left"/>
+      <w:pPr>
+        <w:tabs>
+          <w:tab w:val="num" w:pos="5040"/>
+        </w:tabs>
+        <w:ind w:left="5040" w:hanging="360"/>
+      </w:pPr>
+      <w:rPr>
+        <w:rFonts w:ascii="Symbol" w:hAnsi="Symbol" w:hint="default"/>
+        <w:sz w:val="20"/>
+      </w:rPr>
+    </w:lvl>
+    <w:lvl w:ilvl="7" w:tentative="1">
+      <w:start w:val="1"/>
+      <w:numFmt w:val="bullet"/>
+      <w:lvlText w:val=""/>
+      <w:lvlJc w:val="left"/>
+      <w:pPr>
+        <w:tabs>
+          <w:tab w:val="num" w:pos="5760"/>
+        </w:tabs>
+        <w:ind w:left="5760" w:hanging="360"/>
+      </w:pPr>
+      <w:rPr>
+        <w:rFonts w:ascii="Symbol" w:hAnsi="Symbol" w:hint="default"/>
+        <w:sz w:val="20"/>
+      </w:rPr>
+    </w:lvl>
+    <w:lvl w:ilvl="8" w:tentative="1">
+      <w:start w:val="1"/>
+      <w:numFmt w:val="bullet"/>
+      <w:lvlText w:val=""/>
+      <w:lvlJc w:val="left"/>
+      <w:pPr>
+        <w:tabs>
+          <w:tab w:val="num" w:pos="6480"/>
+        </w:tabs>
+        <w:ind w:left="6480" w:hanging="360"/>
+      </w:pPr>
+      <w:rPr>
+        <w:rFonts w:ascii="Symbol" w:hAnsi="Symbol" w:hint="default"/>
+        <w:sz w:val="20"/>
+      </w:rPr>
+    </w:lvl>
+  </w:abstractNum>
+  <w:abstractNum w:abstractNumId="25" w15:restartNumberingAfterBreak="0">
     <w:nsid w:val="516254C0"/>
     <w:multiLevelType w:val="multilevel"/>
     <w:tmpl w:val="207465E2"/>
@@ -3267,7 +5428,7 @@
       </w:rPr>
     </w:lvl>
   </w:abstractNum>
-  <w:abstractNum w:abstractNumId="15" w15:restartNumberingAfterBreak="0">
+  <w:abstractNum w:abstractNumId="26" w15:restartNumberingAfterBreak="0">
     <w:nsid w:val="51EE660F"/>
     <w:multiLevelType w:val="multilevel"/>
     <w:tmpl w:val="2FF2A472"/>
@@ -3412,7 +5573,7 @@
       </w:rPr>
     </w:lvl>
   </w:abstractNum>
-  <w:abstractNum w:abstractNumId="16" w15:restartNumberingAfterBreak="0">
+  <w:abstractNum w:abstractNumId="27" w15:restartNumberingAfterBreak="0">
     <w:nsid w:val="536477B1"/>
     <w:multiLevelType w:val="multilevel"/>
     <w:tmpl w:val="2D543D7A"/>
@@ -3561,7 +5722,156 @@
       </w:rPr>
     </w:lvl>
   </w:abstractNum>
-  <w:abstractNum w:abstractNumId="17" w15:restartNumberingAfterBreak="0">
+  <w:abstractNum w:abstractNumId="28" w15:restartNumberingAfterBreak="0">
+    <w:nsid w:val="54A91903"/>
+    <w:multiLevelType w:val="multilevel"/>
+    <w:tmpl w:val="708653D4"/>
+    <w:lvl w:ilvl="0">
+      <w:start w:val="1"/>
+      <w:numFmt w:val="bullet"/>
+      <w:lvlText w:val=""/>
+      <w:lvlJc w:val="left"/>
+      <w:pPr>
+        <w:tabs>
+          <w:tab w:val="num" w:pos="720"/>
+        </w:tabs>
+        <w:ind w:left="720" w:hanging="360"/>
+      </w:pPr>
+      <w:rPr>
+        <w:rFonts w:ascii="Symbol" w:hAnsi="Symbol" w:hint="default"/>
+        <w:sz w:val="20"/>
+      </w:rPr>
+    </w:lvl>
+    <w:lvl w:ilvl="1" w:tentative="1">
+      <w:start w:val="1"/>
+      <w:numFmt w:val="bullet"/>
+      <w:lvlText w:val=""/>
+      <w:lvlJc w:val="left"/>
+      <w:pPr>
+        <w:tabs>
+          <w:tab w:val="num" w:pos="1440"/>
+        </w:tabs>
+        <w:ind w:left="1440" w:hanging="360"/>
+      </w:pPr>
+      <w:rPr>
+        <w:rFonts w:ascii="Symbol" w:hAnsi="Symbol" w:hint="default"/>
+        <w:sz w:val="20"/>
+      </w:rPr>
+    </w:lvl>
+    <w:lvl w:ilvl="2" w:tentative="1">
+      <w:start w:val="1"/>
+      <w:numFmt w:val="bullet"/>
+      <w:lvlText w:val=""/>
+      <w:lvlJc w:val="left"/>
+      <w:pPr>
+        <w:tabs>
+          <w:tab w:val="num" w:pos="2160"/>
+        </w:tabs>
+        <w:ind w:left="2160" w:hanging="360"/>
+      </w:pPr>
+      <w:rPr>
+        <w:rFonts w:ascii="Symbol" w:hAnsi="Symbol" w:hint="default"/>
+        <w:sz w:val="20"/>
+      </w:rPr>
+    </w:lvl>
+    <w:lvl w:ilvl="3" w:tentative="1">
+      <w:start w:val="1"/>
+      <w:numFmt w:val="bullet"/>
+      <w:lvlText w:val=""/>
+      <w:lvlJc w:val="left"/>
+      <w:pPr>
+        <w:tabs>
+          <w:tab w:val="num" w:pos="2880"/>
+        </w:tabs>
+        <w:ind w:left="2880" w:hanging="360"/>
+      </w:pPr>
+      <w:rPr>
+        <w:rFonts w:ascii="Symbol" w:hAnsi="Symbol" w:hint="default"/>
+        <w:sz w:val="20"/>
+      </w:rPr>
+    </w:lvl>
+    <w:lvl w:ilvl="4" w:tentative="1">
+      <w:start w:val="1"/>
+      <w:numFmt w:val="bullet"/>
+      <w:lvlText w:val=""/>
+      <w:lvlJc w:val="left"/>
+      <w:pPr>
+        <w:tabs>
+          <w:tab w:val="num" w:pos="3600"/>
+        </w:tabs>
+        <w:ind w:left="3600" w:hanging="360"/>
+      </w:pPr>
+      <w:rPr>
+        <w:rFonts w:ascii="Symbol" w:hAnsi="Symbol" w:hint="default"/>
+        <w:sz w:val="20"/>
+      </w:rPr>
+    </w:lvl>
+    <w:lvl w:ilvl="5" w:tentative="1">
+      <w:start w:val="1"/>
+      <w:numFmt w:val="bullet"/>
+      <w:lvlText w:val=""/>
+      <w:lvlJc w:val="left"/>
+      <w:pPr>
+        <w:tabs>
+          <w:tab w:val="num" w:pos="4320"/>
+        </w:tabs>
+        <w:ind w:left="4320" w:hanging="360"/>
+      </w:pPr>
+      <w:rPr>
+        <w:rFonts w:ascii="Symbol" w:hAnsi="Symbol" w:hint="default"/>
+        <w:sz w:val="20"/>
+      </w:rPr>
+    </w:lvl>
+    <w:lvl w:ilvl="6" w:tentative="1">
+      <w:start w:val="1"/>
+      <w:numFmt w:val="bullet"/>
+      <w:lvlText w:val=""/>
+      <w:lvlJc w:val="left"/>
+      <w:pPr>
+        <w:tabs>
+          <w:tab w:val="num" w:pos="5040"/>
+        </w:tabs>
+        <w:ind w:left="5040" w:hanging="360"/>
+      </w:pPr>
+      <w:rPr>
+        <w:rFonts w:ascii="Symbol" w:hAnsi="Symbol" w:hint="default"/>
+        <w:sz w:val="20"/>
+      </w:rPr>
+    </w:lvl>
+    <w:lvl w:ilvl="7" w:tentative="1">
+      <w:start w:val="1"/>
+      <w:numFmt w:val="bullet"/>
+      <w:lvlText w:val=""/>
+      <w:lvlJc w:val="left"/>
+      <w:pPr>
+        <w:tabs>
+          <w:tab w:val="num" w:pos="5760"/>
+        </w:tabs>
+        <w:ind w:left="5760" w:hanging="360"/>
+      </w:pPr>
+      <w:rPr>
+        <w:rFonts w:ascii="Symbol" w:hAnsi="Symbol" w:hint="default"/>
+        <w:sz w:val="20"/>
+      </w:rPr>
+    </w:lvl>
+    <w:lvl w:ilvl="8" w:tentative="1">
+      <w:start w:val="1"/>
+      <w:numFmt w:val="bullet"/>
+      <w:lvlText w:val=""/>
+      <w:lvlJc w:val="left"/>
+      <w:pPr>
+        <w:tabs>
+          <w:tab w:val="num" w:pos="6480"/>
+        </w:tabs>
+        <w:ind w:left="6480" w:hanging="360"/>
+      </w:pPr>
+      <w:rPr>
+        <w:rFonts w:ascii="Symbol" w:hAnsi="Symbol" w:hint="default"/>
+        <w:sz w:val="20"/>
+      </w:rPr>
+    </w:lvl>
+  </w:abstractNum>
+  <w:abstractNum w:abstractNumId="29" w15:restartNumberingAfterBreak="0">
     <w:nsid w:val="62DE2080"/>
     <w:multiLevelType w:val="multilevel"/>
     <w:tmpl w:val="1470490C"/>
@@ -3710,7 +6020,7 @@
       </w:rPr>
     </w:lvl>
   </w:abstractNum>
-  <w:abstractNum w:abstractNumId="18" w15:restartNumberingAfterBreak="0">
+  <w:abstractNum w:abstractNumId="30" w15:restartNumberingAfterBreak="0">
     <w:nsid w:val="761017A0"/>
     <w:multiLevelType w:val="multilevel"/>
     <w:tmpl w:val="2B6C29A8"/>
@@ -3859,62 +6169,366 @@
       </w:rPr>
     </w:lvl>
   </w:abstractNum>
+  <w:abstractNum w:abstractNumId="31" w15:restartNumberingAfterBreak="0">
+    <w:nsid w:val="77A25A18"/>
+    <w:multiLevelType w:val="hybridMultilevel"/>
+    <w:tmpl w:val="1BDE8094"/>
+    <w:lvl w:ilvl="0" w:tplc="04160001">
+      <w:start w:val="1"/>
+      <w:numFmt w:val="bullet"/>
+      <w:lvlText w:val=""/>
+      <w:lvlJc w:val="left"/>
+      <w:pPr>
+        <w:ind w:left="720" w:hanging="360"/>
+      </w:pPr>
+      <w:rPr>
+        <w:rFonts w:ascii="Symbol" w:hAnsi="Symbol" w:hint="default"/>
+      </w:rPr>
+    </w:lvl>
+    <w:lvl w:ilvl="1" w:tplc="04160003" w:tentative="1">
+      <w:start w:val="1"/>
+      <w:numFmt w:val="bullet"/>
+      <w:lvlText w:val="o"/>
+      <w:lvlJc w:val="left"/>
+      <w:pPr>
+        <w:ind w:left="1440" w:hanging="360"/>
+      </w:pPr>
+      <w:rPr>
+        <w:rFonts w:ascii="Courier New" w:hAnsi="Courier New" w:cs="Courier New" w:hint="default"/>
+      </w:rPr>
+    </w:lvl>
+    <w:lvl w:ilvl="2" w:tplc="04160005" w:tentative="1">
+      <w:start w:val="1"/>
+      <w:numFmt w:val="bullet"/>
+      <w:lvlText w:val=""/>
+      <w:lvlJc w:val="left"/>
+      <w:pPr>
+        <w:ind w:left="2160" w:hanging="360"/>
+      </w:pPr>
+      <w:rPr>
+        <w:rFonts w:ascii="Wingdings" w:hAnsi="Wingdings" w:hint="default"/>
+      </w:rPr>
+    </w:lvl>
+    <w:lvl w:ilvl="3" w:tplc="04160001" w:tentative="1">
+      <w:start w:val="1"/>
+      <w:numFmt w:val="bullet"/>
+      <w:lvlText w:val=""/>
+      <w:lvlJc w:val="left"/>
+      <w:pPr>
+        <w:ind w:left="2880" w:hanging="360"/>
+      </w:pPr>
+      <w:rPr>
+        <w:rFonts w:ascii="Symbol" w:hAnsi="Symbol" w:hint="default"/>
+      </w:rPr>
+    </w:lvl>
+    <w:lvl w:ilvl="4" w:tplc="04160003" w:tentative="1">
+      <w:start w:val="1"/>
+      <w:numFmt w:val="bullet"/>
+      <w:lvlText w:val="o"/>
+      <w:lvlJc w:val="left"/>
+      <w:pPr>
+        <w:ind w:left="3600" w:hanging="360"/>
+      </w:pPr>
+      <w:rPr>
+        <w:rFonts w:ascii="Courier New" w:hAnsi="Courier New" w:cs="Courier New" w:hint="default"/>
+      </w:rPr>
+    </w:lvl>
+    <w:lvl w:ilvl="5" w:tplc="04160005" w:tentative="1">
+      <w:start w:val="1"/>
+      <w:numFmt w:val="bullet"/>
+      <w:lvlText w:val=""/>
+      <w:lvlJc w:val="left"/>
+      <w:pPr>
+        <w:ind w:left="4320" w:hanging="360"/>
+      </w:pPr>
+      <w:rPr>
+        <w:rFonts w:ascii="Wingdings" w:hAnsi="Wingdings" w:hint="default"/>
+      </w:rPr>
+    </w:lvl>
+    <w:lvl w:ilvl="6" w:tplc="04160001" w:tentative="1">
+      <w:start w:val="1"/>
+      <w:numFmt w:val="bullet"/>
+      <w:lvlText w:val=""/>
+      <w:lvlJc w:val="left"/>
+      <w:pPr>
+        <w:ind w:left="5040" w:hanging="360"/>
+      </w:pPr>
+      <w:rPr>
+        <w:rFonts w:ascii="Symbol" w:hAnsi="Symbol" w:hint="default"/>
+      </w:rPr>
+    </w:lvl>
+    <w:lvl w:ilvl="7" w:tplc="04160003" w:tentative="1">
+      <w:start w:val="1"/>
+      <w:numFmt w:val="bullet"/>
+      <w:lvlText w:val="o"/>
+      <w:lvlJc w:val="left"/>
+      <w:pPr>
+        <w:ind w:left="5760" w:hanging="360"/>
+      </w:pPr>
+      <w:rPr>
+        <w:rFonts w:ascii="Courier New" w:hAnsi="Courier New" w:cs="Courier New" w:hint="default"/>
+      </w:rPr>
+    </w:lvl>
+    <w:lvl w:ilvl="8" w:tplc="04160005" w:tentative="1">
+      <w:start w:val="1"/>
+      <w:numFmt w:val="bullet"/>
+      <w:lvlText w:val=""/>
+      <w:lvlJc w:val="left"/>
+      <w:pPr>
+        <w:ind w:left="6480" w:hanging="360"/>
+      </w:pPr>
+      <w:rPr>
+        <w:rFonts w:ascii="Wingdings" w:hAnsi="Wingdings" w:hint="default"/>
+      </w:rPr>
+    </w:lvl>
+  </w:abstractNum>
+  <w:abstractNum w:abstractNumId="32" w15:restartNumberingAfterBreak="0">
+    <w:nsid w:val="78AD446D"/>
+    <w:multiLevelType w:val="multilevel"/>
+    <w:tmpl w:val="7FD480A4"/>
+    <w:lvl w:ilvl="0">
+      <w:start w:val="1"/>
+      <w:numFmt w:val="bullet"/>
+      <w:lvlText w:val=""/>
+      <w:lvlJc w:val="left"/>
+      <w:pPr>
+        <w:tabs>
+          <w:tab w:val="num" w:pos="720"/>
+        </w:tabs>
+        <w:ind w:left="720" w:hanging="360"/>
+      </w:pPr>
+      <w:rPr>
+        <w:rFonts w:ascii="Symbol" w:hAnsi="Symbol" w:hint="default"/>
+        <w:sz w:val="20"/>
+      </w:rPr>
+    </w:lvl>
+    <w:lvl w:ilvl="1">
+      <w:start w:val="1"/>
+      <w:numFmt w:val="bullet"/>
+      <w:lvlText w:val=""/>
+      <w:lvlJc w:val="left"/>
+      <w:pPr>
+        <w:tabs>
+          <w:tab w:val="num" w:pos="1440"/>
+        </w:tabs>
+        <w:ind w:left="1440" w:hanging="360"/>
+      </w:pPr>
+      <w:rPr>
+        <w:rFonts w:ascii="Symbol" w:hAnsi="Symbol" w:hint="default"/>
+        <w:sz w:val="20"/>
+      </w:rPr>
+    </w:lvl>
+    <w:lvl w:ilvl="2" w:tentative="1">
+      <w:start w:val="1"/>
+      <w:numFmt w:val="bullet"/>
+      <w:lvlText w:val=""/>
+      <w:lvlJc w:val="left"/>
+      <w:pPr>
+        <w:tabs>
+          <w:tab w:val="num" w:pos="2160"/>
+        </w:tabs>
+        <w:ind w:left="2160" w:hanging="360"/>
+      </w:pPr>
+      <w:rPr>
+        <w:rFonts w:ascii="Symbol" w:hAnsi="Symbol" w:hint="default"/>
+        <w:sz w:val="20"/>
+      </w:rPr>
+    </w:lvl>
+    <w:lvl w:ilvl="3" w:tentative="1">
+      <w:start w:val="1"/>
+      <w:numFmt w:val="bullet"/>
+      <w:lvlText w:val=""/>
+      <w:lvlJc w:val="left"/>
+      <w:pPr>
+        <w:tabs>
+          <w:tab w:val="num" w:pos="2880"/>
+        </w:tabs>
+        <w:ind w:left="2880" w:hanging="360"/>
+      </w:pPr>
+      <w:rPr>
+        <w:rFonts w:ascii="Symbol" w:hAnsi="Symbol" w:hint="default"/>
+        <w:sz w:val="20"/>
+      </w:rPr>
+    </w:lvl>
+    <w:lvl w:ilvl="4" w:tentative="1">
+      <w:start w:val="1"/>
+      <w:numFmt w:val="bullet"/>
+      <w:lvlText w:val=""/>
+      <w:lvlJc w:val="left"/>
+      <w:pPr>
+        <w:tabs>
+          <w:tab w:val="num" w:pos="3600"/>
+        </w:tabs>
+        <w:ind w:left="3600" w:hanging="360"/>
+      </w:pPr>
+      <w:rPr>
+        <w:rFonts w:ascii="Symbol" w:hAnsi="Symbol" w:hint="default"/>
+        <w:sz w:val="20"/>
+      </w:rPr>
+    </w:lvl>
+    <w:lvl w:ilvl="5" w:tentative="1">
+      <w:start w:val="1"/>
+      <w:numFmt w:val="bullet"/>
+      <w:lvlText w:val=""/>
+      <w:lvlJc w:val="left"/>
+      <w:pPr>
+        <w:tabs>
+          <w:tab w:val="num" w:pos="4320"/>
+        </w:tabs>
+        <w:ind w:left="4320" w:hanging="360"/>
+      </w:pPr>
+      <w:rPr>
+        <w:rFonts w:ascii="Symbol" w:hAnsi="Symbol" w:hint="default"/>
+        <w:sz w:val="20"/>
+      </w:rPr>
+    </w:lvl>
+    <w:lvl w:ilvl="6" w:tentative="1">
+      <w:start w:val="1"/>
+      <w:numFmt w:val="bullet"/>
+      <w:lvlText w:val=""/>
+      <w:lvlJc w:val="left"/>
+      <w:pPr>
+        <w:tabs>
+          <w:tab w:val="num" w:pos="5040"/>
+        </w:tabs>
+        <w:ind w:left="5040" w:hanging="360"/>
+      </w:pPr>
+      <w:rPr>
+        <w:rFonts w:ascii="Symbol" w:hAnsi="Symbol" w:hint="default"/>
+        <w:sz w:val="20"/>
+      </w:rPr>
+    </w:lvl>
+    <w:lvl w:ilvl="7" w:tentative="1">
+      <w:start w:val="1"/>
+      <w:numFmt w:val="bullet"/>
+      <w:lvlText w:val=""/>
+      <w:lvlJc w:val="left"/>
+      <w:pPr>
+        <w:tabs>
+          <w:tab w:val="num" w:pos="5760"/>
+        </w:tabs>
+        <w:ind w:left="5760" w:hanging="360"/>
+      </w:pPr>
+      <w:rPr>
+        <w:rFonts w:ascii="Symbol" w:hAnsi="Symbol" w:hint="default"/>
+        <w:sz w:val="20"/>
+      </w:rPr>
+    </w:lvl>
+    <w:lvl w:ilvl="8" w:tentative="1">
+      <w:start w:val="1"/>
+      <w:numFmt w:val="bullet"/>
+      <w:lvlText w:val=""/>
+      <w:lvlJc w:val="left"/>
+      <w:pPr>
+        <w:tabs>
+          <w:tab w:val="num" w:pos="6480"/>
+        </w:tabs>
+        <w:ind w:left="6480" w:hanging="360"/>
+      </w:pPr>
+      <w:rPr>
+        <w:rFonts w:ascii="Symbol" w:hAnsi="Symbol" w:hint="default"/>
+        <w:sz w:val="20"/>
+      </w:rPr>
+    </w:lvl>
+  </w:abstractNum>
   <w:num w:numId="1" w16cid:durableId="395014252">
+    <w:abstractNumId w:val="6"/>
+  </w:num>
+  <w:num w:numId="2" w16cid:durableId="1220020287">
+    <w:abstractNumId w:val="9"/>
+  </w:num>
+  <w:num w:numId="3" w16cid:durableId="602497615">
     <w:abstractNumId w:val="4"/>
   </w:num>
-  <w:num w:numId="2" w16cid:durableId="1220020287">
-    <w:abstractNumId w:val="6"/>
-  </w:num>
-  <w:num w:numId="3" w16cid:durableId="602497615">
-    <w:abstractNumId w:val="2"/>
-  </w:num>
   <w:num w:numId="4" w16cid:durableId="1378582515">
-    <w:abstractNumId w:val="10"/>
+    <w:abstractNumId w:val="16"/>
   </w:num>
   <w:num w:numId="5" w16cid:durableId="1682126795">
-    <w:abstractNumId w:val="17"/>
+    <w:abstractNumId w:val="29"/>
   </w:num>
   <w:num w:numId="6" w16cid:durableId="1341007844">
-    <w:abstractNumId w:val="9"/>
+    <w:abstractNumId w:val="14"/>
   </w:num>
   <w:num w:numId="7" w16cid:durableId="1873689679">
     <w:abstractNumId w:val="0"/>
   </w:num>
   <w:num w:numId="8" w16cid:durableId="1834486564">
-    <w:abstractNumId w:val="16"/>
+    <w:abstractNumId w:val="27"/>
   </w:num>
   <w:num w:numId="9" w16cid:durableId="1086920593">
+    <w:abstractNumId w:val="3"/>
+  </w:num>
+  <w:num w:numId="10" w16cid:durableId="14692937">
+    <w:abstractNumId w:val="19"/>
+  </w:num>
+  <w:num w:numId="11" w16cid:durableId="332224146">
+    <w:abstractNumId w:val="26"/>
+  </w:num>
+  <w:num w:numId="12" w16cid:durableId="2102219261">
+    <w:abstractNumId w:val="25"/>
+  </w:num>
+  <w:num w:numId="13" w16cid:durableId="2049254213">
+    <w:abstractNumId w:val="5"/>
+  </w:num>
+  <w:num w:numId="14" w16cid:durableId="1085423397">
+    <w:abstractNumId w:val="20"/>
+  </w:num>
+  <w:num w:numId="15" w16cid:durableId="1032000383">
+    <w:abstractNumId w:val="10"/>
+  </w:num>
+  <w:num w:numId="16" w16cid:durableId="928732500">
+    <w:abstractNumId w:val="22"/>
+  </w:num>
+  <w:num w:numId="17" w16cid:durableId="1150711281">
+    <w:abstractNumId w:val="13"/>
+  </w:num>
+  <w:num w:numId="18" w16cid:durableId="723715536">
+    <w:abstractNumId w:val="30"/>
+  </w:num>
+  <w:num w:numId="19" w16cid:durableId="690912530">
+    <w:abstractNumId w:val="7"/>
+  </w:num>
+  <w:num w:numId="20" w16cid:durableId="152138951">
+    <w:abstractNumId w:val="11"/>
+  </w:num>
+  <w:num w:numId="21" w16cid:durableId="947737261">
+    <w:abstractNumId w:val="28"/>
+  </w:num>
+  <w:num w:numId="22" w16cid:durableId="1532064800">
+    <w:abstractNumId w:val="2"/>
+  </w:num>
+  <w:num w:numId="23" w16cid:durableId="830027045">
+    <w:abstractNumId w:val="31"/>
+  </w:num>
+  <w:num w:numId="24" w16cid:durableId="2123960151">
+    <w:abstractNumId w:val="18"/>
+  </w:num>
+  <w:num w:numId="25" w16cid:durableId="2087914249">
+    <w:abstractNumId w:val="32"/>
+  </w:num>
+  <w:num w:numId="26" w16cid:durableId="189220083">
+    <w:abstractNumId w:val="23"/>
+  </w:num>
+  <w:num w:numId="27" w16cid:durableId="174271764">
     <w:abstractNumId w:val="1"/>
   </w:num>
-  <w:num w:numId="10" w16cid:durableId="14692937">
-    <w:abstractNumId w:val="11"/>
+  <w:num w:numId="28" w16cid:durableId="1099839599">
+    <w:abstractNumId w:val="17"/>
   </w:num>
-  <w:num w:numId="11" w16cid:durableId="332224146">
-    <w:abstractNumId w:val="15"/>
+  <w:num w:numId="29" w16cid:durableId="1066563697">
+    <w:abstractNumId w:val="24"/>
   </w:num>
-  <w:num w:numId="12" w16cid:durableId="2102219261">
-    <w:abstractNumId w:val="14"/>
+  <w:num w:numId="30" w16cid:durableId="1977640520">
+    <w:abstractNumId w:val="8"/>
   </w:num>
-  <w:num w:numId="13" w16cid:durableId="2049254213">
-    <w:abstractNumId w:val="3"/>
-  </w:num>
-  <w:num w:numId="14" w16cid:durableId="1085423397">
+  <w:num w:numId="31" w16cid:durableId="427773561">
     <w:abstractNumId w:val="12"/>
   </w:num>
-  <w:num w:numId="15" w16cid:durableId="1032000383">
-    <w:abstractNumId w:val="7"/>
+  <w:num w:numId="32" w16cid:durableId="571816444">
+    <w:abstractNumId w:val="21"/>
   </w:num>
-  <w:num w:numId="16" w16cid:durableId="928732500">
-    <w:abstractNumId w:val="13"/>
-  </w:num>
-  <w:num w:numId="17" w16cid:durableId="1150711281">
-    <w:abstractNumId w:val="8"/>
-  </w:num>
-  <w:num w:numId="18" w16cid:durableId="723715536">
-    <w:abstractNumId w:val="18"/>
-  </w:num>
-  <w:num w:numId="19" w16cid:durableId="690912530">
-    <w:abstractNumId w:val="5"/>
+  <w:num w:numId="33" w16cid:durableId="1355154643">
+    <w:abstractNumId w:val="15"/>
   </w:num>
 </w:numbering>
 </file>
@@ -4522,6 +7136,7 @@
   <w:style w:type="character" w:default="1" w:styleId="Fontepargpadro">
     <w:name w:val="Default Paragraph Font"/>
     <w:uiPriority w:val="1"/>
+    <w:semiHidden/>
     <w:unhideWhenUsed/>
   </w:style>
   <w:style w:type="table" w:default="1" w:styleId="Tabelanormal">

</xml_diff>